<commit_message>
Add phase 2 topic extractions, qwen2.5-7b output, and --csv flag
Expand extraction pipeline with 9 new topic-specific outputs (celldeath,
circadian, genetox, inflammasome, intestine, nrf2dose, senescence, testis,
vascular). Add extract_phase2_runner.py and README_pipeline.md. Update
interpret.py to accept --csv flag as alternative to positional arg.
Regenerate all interpretation reports with updated data.

Co-Authored-By: Claude Opus 4.6 <noreply@anthropic.com>
</commit_message>
<xml_diff>
--- a/output/interpretation_claude-opus-4-6.docx
+++ b/output/interpretation_claude-opus-4-6.docx
@@ -16,7 +16,37 @@
         <w:pStyle w:val="Heading1"/>
       </w:pPr>
       <w:r>
-        <w:t>Run 1 (79.0s)</w:t>
+        <w:t>Run 1 (78.9s)</w:t>
+      </w:r>
+    </w:p>
+    <w:p>
+      <w:pPr>
+        <w:pStyle w:val="Heading2"/>
+      </w:pPr>
+      <w:r>
+        <w:t>Comprehensive Toxicogenomic Interpretation Report</w:t>
+      </w:r>
+    </w:p>
+    <w:p>
+      <w:pPr>
+        <w:pStyle w:val="Heading2"/>
+      </w:pPr>
+      <w:r>
+        <w:t>Executive Summary</w:t>
+      </w:r>
+    </w:p>
+    <w:p>
+      <w:pPr>
+        <w:spacing w:after="120"/>
+      </w:pPr>
+      <w:r>
+        <w:rPr>
+          <w:rFonts w:ascii="Calibri" w:hAnsi="Calibri"/>
+          <w:b w:val="0"/>
+          <w:i w:val="0"/>
+          <w:sz w:val="22"/>
+        </w:rPr>
+        <w:t>This dose-response analysis reveals a coherent toxicological signature characterized by early activation of xenobiotic metabolism and oxidative stress defense pathways (BMD 0.2–0.55), followed by progressive engagement of inflammatory, apoptotic, and tissue-remodeling cascades at higher doses (BMD 2–20). Of 32 responsive genes, 27 are upregulated and 5 downregulated, indicating a predominantly activating transcriptional response. The molecular signature is consistent with exposure to a xenobiotic compound that generates reactive oxygen species (ROS) and/or electrophilic metabolites, triggering the KEAP1-NRF2-ARE axis as a primary adaptive response, with subsequent NF-κB-mediated inflammation and TP53-dependent apoptosis at doses exceeding the adaptive capacity. The liver, kidney, testis, brain, and cardiovascular system are predicted as primary target organs.</w:t>
       </w:r>
     </w:p>
     <w:p>
@@ -38,7 +68,15 @@
         <w:pStyle w:val="Heading2"/>
       </w:pPr>
       <w:r>
-        <w:t>1. Biological Response Narrative</w:t>
+        <w:t>1. Biological Response Narrative: Dose-Ordered Progression of Effects</w:t>
+      </w:r>
+    </w:p>
+    <w:p>
+      <w:pPr>
+        <w:pStyle w:val="Heading3"/>
+      </w:pPr>
+      <w:r>
+        <w:t>Phase I — Immediate Xenobiotic Sensing and Metabolic Activation (BMD 0.2–0.55)</w:t>
       </w:r>
     </w:p>
     <w:p>
@@ -52,15 +90,7 @@
           <w:i w:val="0"/>
           <w:sz w:val="22"/>
         </w:rPr>
-        <w:t>The 32 responsive genes (27 upregulated, 5 downregulated) across a BMD range of 0.2–20 reveal a coherent, dose-dependent progression from early adaptive cytoprotection to overt cellular damage, inflammation, and pro-apoptotic signaling.</w:t>
-      </w:r>
-    </w:p>
-    <w:p>
-      <w:pPr>
-        <w:pStyle w:val="Heading3"/>
-      </w:pPr>
-      <w:r>
-        <w:t>Ultra-Low Dose Range (BMD 0.2–0.55): Xenobiotic Sensing and Cytoprotective Activation</w:t>
+        <w:t>The earliest transcriptional responses occur at the lowest benchmark doses (BMD 0.2–0.35) and are dominated by **aryl hydrocarbon receptor (AHR) signaling**. Three genes are upregulated in this initial cluster, including **AHR** itself and its canonical transcriptional targets **CYP1A1** and **CYP1B1**. This signature is diagnostic of ligand-dependent AHR activation, consistent with exposure to a planar aromatic or dioxin-like compound, or a xenobiotic that is metabolized to AHR-activating intermediates. The AHR pathway (median BMD 0.35) represents the most sensitive molecular response detected in this analysis.</w:t>
       </w:r>
     </w:p>
     <w:p>
@@ -74,7 +104,7 @@
           <w:i w:val="0"/>
           <w:sz w:val="22"/>
         </w:rPr>
-        <w:t>The earliest transcriptional responses involve activation of the **aryl hydrocarbon receptor (AHR) signaling axis** (median BMD 0.35), with upregulation of AHR and its canonical target genes **CYP1A1** and **CYP1B1**. This represents the molecular initiating event: ligand-dependent or stress-dependent activation of AHR, triggering Phase I xenobiotic metabolism. Concurrently, the **KEAP1-NFE2L2 (NRF2) pathway** is engaged at similarly low BMDs (median BMD 0.5–0.55), with upregulation of **NFE2L2** and its downstream targets **NQO1**, **HMOX1**, and **GCLC**. The chemical environment pathway (path:hsa05208/rno05208, median BMD 0.5) captures this integrated AHR-NRF2 response, involving 9 genes (AHR, CYP1A1, HIF1A, HMOX1, KEAP1, NFE2L2, NFKB1, NQO1, VEGFA). Metabolic pathways (path:rno01100, median BMD 0.5) and biosynthesis of cofactors (path:hsa01240, median BMD 0.55) are also activated, reflecting early metabolic reprogramming.</w:t>
+        <w:t>Immediately following AHR activation, the **chemical carcinogenesis – reactive oxygen species pathway** (path:hsa05208/rno05208; median BMD 0.5) is engaged, with 9 of 16 pathway genes responsive. This pathway includes AHR, CYP1A1, HIF1A, HMOX1, KEAP1, NFE2L2, NFKB1, NQO1, and VEGFA, indicating that Phase I metabolic activation (via CYP1A1/CYP1B1) is generating reactive metabolites and/or ROS that immediately trigger the oxidative stress response.</w:t>
       </w:r>
     </w:p>
     <w:p>
@@ -88,15 +118,35 @@
           <w:i w:val="0"/>
           <w:sz w:val="22"/>
         </w:rPr>
-        <w:t>Notably, the NFE2L2-mediated nuclear events show mixed directionality at this stage, with KEAP1 expression changes suggesting a dynamic regulatory interplay between the negative regulator KEAP1 and the transcription factor NFE2L2—consistent with the canonical model of KEAP1-mediated NRF2 degradation being disrupted by electrophilic or oxidative stress.</w:t>
+        <w:t>Concurrently (BMD 0.3–0.55), the **KEAP1-NRF2 axis** is activated, as evidenced by upregulation of NFE2L2 (NRF2) and modulation of KEAP1, along with nuclear events mediated by NFE2L2 and GSK3B/BTRC:CUL1-mediated degradation of NFE2L2. The mixed directionality (KEAP1 potentially downregulated, NFE2L2 upregulated) is consistent with canonical NRF2 pathway activation: under oxidative stress, KEAP1-mediated ubiquitination of NRF2 is disrupted, allowing NRF2 nuclear translocation and transcription of cytoprotective genes. The downstream NRF2 targets **NQO1**, **HMOX1**, and **GCLC** are upregulated at BMDs of 0.4–0.87, confirming functional activation of the antioxidant response element (ARE) battery.</w:t>
       </w:r>
     </w:p>
     <w:p>
       <w:pPr>
+        <w:spacing w:after="120"/>
+      </w:pPr>
+      <w:r>
+        <w:rPr>
+          <w:rFonts w:ascii="Calibri" w:hAnsi="Calibri"/>
+          <w:b/>
+          <w:sz w:val="22"/>
+        </w:rPr>
+        <w:t xml:space="preserve">Metabolic pathway genes: </w:t>
+      </w:r>
+      <w:r>
+        <w:rPr>
+          <w:rFonts w:ascii="Calibri" w:hAnsi="Calibri"/>
+          <w:sz w:val="22"/>
+        </w:rPr>
+        <w:t>(path:hsa01100/rno01100; median BMD 0.5) including biosynthesis of cofactors (path:hsa01240; median BMD 0.55) are also engaged at this early stage, reflecting metabolic reprogramming in response to xenobiotic challenge.</w:t>
+      </w:r>
+    </w:p>
+    <w:p>
+      <w:pPr>
         <w:pStyle w:val="Heading3"/>
       </w:pPr>
       <w:r>
-        <w:t>Low Dose Range (BMD 0.4–2.0): Ferroptosis Signaling and Early Stress Responses</w:t>
+        <w:t>Phase II — Ferroptosis Signaling and Early Stress Responses (BMD 0.4–2.0)</w:t>
       </w:r>
     </w:p>
     <w:p>
@@ -110,15 +160,7 @@
           <w:i w:val="0"/>
           <w:sz w:val="22"/>
         </w:rPr>
-        <w:t>Ferroptosis-related pathways (path:hsa04216/rno04216, median BMD 0.6) emerge with 3 genes upregulated, suggesting that oxidative lipid damage pathways are being engaged even at low doses. This is consistent with the upregulation of antioxidant genes (GPX1, SOD1, SOD2, CAT) observed in the GO enrichment for "response to oxidative stress" (GO:0006979) and "response to hydrogen peroxide" (GO:0042542). The activation of **HIF1A** at low BMDs further indicates that the cellular oxygen-sensing machinery is responding to redox perturbation, consistent with the GO term "response to hypoxia" (GO:0001666, 15 genes).</w:t>
-      </w:r>
-    </w:p>
-    <w:p>
-      <w:pPr>
-        <w:pStyle w:val="Heading3"/>
-      </w:pPr>
-      <w:r>
-        <w:t>Transitional Dose Range (BMD 2.0–4.0): Circadian Disruption, Autophagy, and Emerging Stress</w:t>
+        <w:t>Between BMD 0.4 and 2.0, the **ferroptosis pathway** (path:hsa04216/rno04216; median BMD 0.6) is activated, with 3 genes upregulated. This is notable because ferroptosis—an iron-dependent form of regulated cell death driven by lipid peroxidation—is mechanistically linked to oxidative stress and is modulated by GPX1, HMOX1, and the NRF2 pathway. The activation of ferroptosis-related genes at this relatively low dose suggests that lipid peroxidation is an early consequence of the ROS generated by Phase I metabolism.</w:t>
       </w:r>
     </w:p>
     <w:p>
@@ -132,27 +174,15 @@
           <w:i w:val="0"/>
           <w:sz w:val="22"/>
         </w:rPr>
-        <w:t>A qualitative shift occurs in this range. **Circadian clock genes** are downregulated (median BMD 2.25), representing one of the few downregulated responses. Disruption of circadian regulation is increasingly recognized as a consequence of oxidative stress and NRF2 activation, and may reflect systemic metabolic dysregulation.</w:t>
+        <w:t>The **cushing syndrome pathway** (path:hsa04934/rno04934; median BMD 2.35) and **circadian clock** genes (median BMD 2.25, mostly downregulated) also respond in this range. The downregulation of circadian clock components is significant: disruption of circadian regulation has been linked to impaired xenobiotic metabolism and enhanced susceptibility to oxidative damage. This may represent an early systemic stress signal.</w:t>
       </w:r>
     </w:p>
     <w:p>
       <w:pPr>
-        <w:spacing w:after="120"/>
+        <w:pStyle w:val="Heading3"/>
       </w:pPr>
       <w:r>
-        <w:rPr>
-          <w:rFonts w:ascii="Calibri" w:hAnsi="Calibri"/>
-          <w:b/>
-          <w:sz w:val="22"/>
-        </w:rPr>
-        <w:t xml:space="preserve">Autophagy: </w:t>
-      </w:r>
-      <w:r>
-        <w:rPr>
-          <w:rFonts w:ascii="Calibri" w:hAnsi="Calibri"/>
-          <w:sz w:val="22"/>
-        </w:rPr>
-        <w:t>(path:hsa04140/rno04140, median BMD 3.5) and **mitophagy** (path:hsa04137/rno04137, median BMD 3.5) pathways are activated, with upregulation of **SQSTM1** (p62), a key autophagy receptor and NRF2 pathway modulator. This represents an intermediate adaptive response—cells are attempting to clear damaged organelles and protein aggregates. The **Wnt signaling pathway** (path:hsa04310, median BMD 3.75) shows mixed directionality, suggesting complex regulation of cell fate decisions.</w:t>
+        <w:t>Phase III — Transition to Inflammatory and Pro-Survival Signaling (BMD 2.5–5.0)</w:t>
       </w:r>
     </w:p>
     <w:p>
@@ -166,15 +196,80 @@
           <w:i w:val="0"/>
           <w:sz w:val="22"/>
         </w:rPr>
-        <w:t>The fluid shear stress and atherosclerosis pathway (path:hsa05418/rno05418, median BMD 4.0) engages 11 genes including BCL2, HMOX1, IL1B, KEAP1, NFE2L2, NFKB1, NQO1, SQSTM1, TNF, TP53, and VEGFA—indicating that vascular and endothelial stress responses are becoming prominent.</w:t>
+        <w:t>At BMD 2.5–5.0, the transcriptional program shifts markedly from purely adaptive/cytoprotective to include **inflammatory and pro-survival signaling**:</w:t>
       </w:r>
     </w:p>
     <w:p>
       <w:pPr>
+        <w:pStyle w:val="ListBullet"/>
+        <w:spacing w:after="40"/>
+      </w:pPr>
+      <w:r>
+        <w:rPr>
+          <w:rFonts w:ascii="Calibri" w:hAnsi="Calibri"/>
+          <w:sz w:val="22"/>
+        </w:rPr>
+        <w:t>**Mitophagy** (path:hsa04137/rno04137; median BMD 3.5) and **autophagy** (path:hsa04140/rno04140; median BMD 3.5) pathways are upregulated, indicating that damaged mitochondria and cellular components are being cleared. The upregulation of **SQSTM1/p62** is consistent with selective autophagy activation and is a known NRF2 target that creates a positive feedback loop (SQSTM1 sequesters KEAP1, further stabilizing NRF2).</w:t>
+      </w:r>
+    </w:p>
+    <w:p>
+      <w:pPr>
+        <w:pStyle w:val="ListBullet"/>
+        <w:spacing w:after="40"/>
+      </w:pPr>
+      <w:r>
+        <w:rPr>
+          <w:rFonts w:ascii="Calibri" w:hAnsi="Calibri"/>
+          <w:sz w:val="22"/>
+        </w:rPr>
+        <w:t>**Wnt signaling** (path:hsa04310; median BMD 3.75) shows mixed directionality, suggesting complex regulation of cell fate decisions.</w:t>
+      </w:r>
+    </w:p>
+    <w:p>
+      <w:pPr>
+        <w:pStyle w:val="ListBullet"/>
+        <w:spacing w:after="40"/>
+      </w:pPr>
+      <w:r>
+        <w:rPr>
+          <w:rFonts w:ascii="Calibri" w:hAnsi="Calibri"/>
+          <w:sz w:val="22"/>
+        </w:rPr>
+        <w:t>The **lipid and atherosclerosis pathway** (path:hsa05417/rno05417; median BMD 8.25 overall, but individual genes begin responding from BMD 0.3) engages 12 of 17 genes, including BAX, BCL2, CASP3, CYP1A1, IL1B, IL6, NFE2L2, NFKB1, NLRP3, STAT3, TNF, and TP53. This pathway integrates oxidative stress, inflammation, and cell death—hallmarks of the transition from adaptive to adverse responses.</w:t>
+      </w:r>
+    </w:p>
+    <w:p>
+      <w:pPr>
+        <w:pStyle w:val="ListBullet"/>
+        <w:spacing w:after="40"/>
+      </w:pPr>
+      <w:r>
+        <w:rPr>
+          <w:rFonts w:ascii="Calibri" w:hAnsi="Calibri"/>
+          <w:sz w:val="22"/>
+        </w:rPr>
+        <w:t>**Fluid shear stress and atherosclerosis** (path:hsa05418/rno05418; median BMD 4.0) with 11 genes including the NRF2 battery (HMOX1, NQO1, NFE2L2, KEAP1) alongside inflammatory mediators (IL1B, TNF, NFKB1) and TP53, indicates vascular stress responses.</w:t>
+      </w:r>
+    </w:p>
+    <w:p>
+      <w:pPr>
+        <w:pStyle w:val="ListBullet"/>
+        <w:spacing w:after="40"/>
+      </w:pPr>
+      <w:r>
+        <w:rPr>
+          <w:rFonts w:ascii="Calibri" w:hAnsi="Calibri"/>
+          <w:sz w:val="22"/>
+        </w:rPr>
+        <w:t>**Pathways in cancer** (path:hsa05200/rno05200; median BMD 5.0) with 15 of 26 genes responsive represents the broadest pathway engagement, reflecting the convergence of proliferative (VEGFA, STAT3, HIF1A), apoptotic (BAX, CASP3, TP53), and survival (BCL2, NFKB1) signals.</w:t>
+      </w:r>
+    </w:p>
+    <w:p>
+      <w:pPr>
         <w:pStyle w:val="Heading3"/>
       </w:pPr>
       <w:r>
-        <w:t>Moderate Dose Range (BMD 4.0–6.0): Cancer-Related Pathways, p53 Activation, and Inflammatory Signaling</w:t>
+        <w:t>Phase IV — Overt Inflammatory Response and Tissue Damage (BMD 5.0–10.0)</w:t>
       </w:r>
     </w:p>
     <w:p>
@@ -188,7 +283,93 @@
           <w:i w:val="0"/>
           <w:sz w:val="22"/>
         </w:rPr>
-        <w:t>This range marks the transition from predominantly adaptive to overtly adverse responses. The **pathways in cancer** (path:hsa05200/rno05200, median BMD 5.0) engage 15 genes, representing the most enriched pathway in the dataset (p = 5.92 × 10⁻³⁸). Key cancer-associated genes including **TP53**, **CDKN1A** (p21), **BAX**, **BCL2**, **CASP3**, and **STAT3** are upregulated, indicating activation of tumor suppressor and cell cycle arrest programs.</w:t>
+        <w:t>This phase is characterized by robust upregulation of **pro-inflammatory cytokines and inflammasome components**:</w:t>
+      </w:r>
+    </w:p>
+    <w:p>
+      <w:pPr>
+        <w:pStyle w:val="ListBullet"/>
+        <w:spacing w:after="40"/>
+      </w:pPr>
+      <w:r>
+        <w:rPr>
+          <w:rFonts w:ascii="Calibri" w:hAnsi="Calibri"/>
+          <w:sz w:val="22"/>
+        </w:rPr>
+        <w:t>**IL6, IL1B, TNF** are upregulated, activating the **JAK-STAT signaling pathway** (path:hsa04630; median BMD 7.0), **NF-κB signaling** (path:hsa04064; median BMD 9.5), and **TNF signaling** (path:hsa04668; median BMD 10.0).</w:t>
+      </w:r>
+    </w:p>
+    <w:p>
+      <w:pPr>
+        <w:pStyle w:val="ListBullet"/>
+        <w:spacing w:after="40"/>
+      </w:pPr>
+      <w:r>
+        <w:rPr>
+          <w:rFonts w:ascii="Calibri" w:hAnsi="Calibri"/>
+          <w:sz w:val="22"/>
+        </w:rPr>
+        <w:t>**NLRP3 inflammasome** activation is evidenced by upregulation of NLRP3 alongside IL1B, consistent with canonical inflammasome assembly and pyroptotic signaling. The inflammasome pathway itself (Reactome) has a median BMD of 12.0, but individual components respond earlier.</w:t>
+      </w:r>
+    </w:p>
+    <w:p>
+      <w:pPr>
+        <w:pStyle w:val="ListBullet"/>
+        <w:spacing w:after="40"/>
+      </w:pPr>
+      <w:r>
+        <w:rPr>
+          <w:rFonts w:ascii="Calibri" w:hAnsi="Calibri"/>
+          <w:sz w:val="22"/>
+        </w:rPr>
+        <w:t>**TP53 signaling** (path:hsa04115; median BMD 5.5) with 5 genes, including TP53 itself, CDKN1A (p21), BAX, CASP3, and GDF15, indicates activation of the DNA damage response and pro-apoptotic programming. The upregulation of **GDF15** (growth differentiation factor 15) is particularly notable as a stress-responsive cytokine and biomarker of mitochondrial dysfunction and cellular stress.</w:t>
+      </w:r>
+    </w:p>
+    <w:p>
+      <w:pPr>
+        <w:pStyle w:val="ListBullet"/>
+        <w:spacing w:after="40"/>
+      </w:pPr>
+      <w:r>
+        <w:rPr>
+          <w:rFonts w:ascii="Calibri" w:hAnsi="Calibri"/>
+          <w:sz w:val="22"/>
+        </w:rPr>
+        <w:t>**Apoptosis** (path:hsa04210; median BMD 7.0) with 6 genes, and **necroptosis** (path:hsa04217; median BMD 8.5) with 7 genes, indicate that multiple cell death modalities are engaged.</w:t>
+      </w:r>
+    </w:p>
+    <w:p>
+      <w:pPr>
+        <w:pStyle w:val="ListBullet"/>
+        <w:spacing w:after="40"/>
+      </w:pPr>
+      <w:r>
+        <w:rPr>
+          <w:rFonts w:ascii="Calibri" w:hAnsi="Calibri"/>
+          <w:sz w:val="22"/>
+        </w:rPr>
+        <w:t>**HIF1A signaling** (path:hsa05167; median BMD 6.0) with VEGFA upregulation suggests tissue hypoxia, possibly secondary to vascular damage or mitochondrial dysfunction.</w:t>
+      </w:r>
+    </w:p>
+    <w:p>
+      <w:pPr>
+        <w:pStyle w:val="ListBullet"/>
+        <w:spacing w:after="40"/>
+      </w:pPr>
+      <w:r>
+        <w:rPr>
+          <w:rFonts w:ascii="Calibri" w:hAnsi="Calibri"/>
+          <w:sz w:val="22"/>
+        </w:rPr>
+        <w:t>**TGFB1** upregulation at this stage signals the initiation of **fibrotic remodeling**, consistent with chronic tissue injury responses.</w:t>
+      </w:r>
+    </w:p>
+    <w:p>
+      <w:pPr>
+        <w:pStyle w:val="Heading3"/>
+      </w:pPr>
+      <w:r>
+        <w:t>Phase V — Immune Activation, Tissue Remodeling, and Systemic Effects (BMD 10.0–20.0)</w:t>
       </w:r>
     </w:p>
     <w:p>
@@ -202,179 +383,72 @@
           <w:i w:val="0"/>
           <w:sz w:val="22"/>
         </w:rPr>
-        <w:t>The **p53 signaling pathway** (path:hsa04115/rno04115, median BMD 5.5) is activated with 5 genes, and TP53-regulated transcription of cell cycle genes (median BMD 5.25) and cell death genes (median BMD 5.75) are engaged sequentially. This temporal ordering—cell cycle arrest preceding apoptotic commitment—is biologically coherent and suggests that cells initially attempt growth arrest before committing to programmed cell death.</w:t>
+        <w:t>At the highest doses, the response expands to include:</w:t>
       </w:r>
     </w:p>
     <w:p>
       <w:pPr>
-        <w:spacing w:after="120"/>
-      </w:pPr>
-      <w:r>
-        <w:rPr>
-          <w:rFonts w:ascii="Calibri" w:hAnsi="Calibri"/>
-          <w:b w:val="0"/>
-          <w:i w:val="0"/>
-          <w:sz w:val="22"/>
-        </w:rPr>
-        <w:t>The **PI3K-Akt signaling pathway** (path:hsa04151, median BMD 5.25) and **HIF-1 signaling** (path:hsa04066, median BMD 5.0) are activated, reflecting survival signaling that competes with pro-apoptotic programs. **Cell cycle** pathway activation (path:hsa04110, median BMD 5.0) with CDKN1A upregulation indicates G1/S checkpoint engagement.</w:t>
-      </w:r>
-    </w:p>
-    <w:p>
-      <w:pPr>
-        <w:spacing w:after="120"/>
-      </w:pPr>
-      <w:r>
-        <w:rPr>
-          <w:rFonts w:ascii="Calibri" w:hAnsi="Calibri"/>
-          <w:b w:val="0"/>
-          <w:i w:val="0"/>
-          <w:sz w:val="22"/>
-        </w:rPr>
-        <w:t>Multiple organ-specific disease pathways emerge: **hepatocellular carcinoma** (path:hsa05225, median BMD 2.65), **renal cell carcinoma** (path:hsa05211, median BMD 4.25), **gastric cancer** (path:hsa05226, median BMD 5.5), **bladder cancer** (path:hsa05219, median BMD 4.5), and **prostate cancer** (path:hsa05215, median BMD 5.25).</w:t>
-      </w:r>
-    </w:p>
-    <w:p>
-      <w:pPr>
-        <w:pStyle w:val="Heading3"/>
-      </w:pPr>
-      <w:r>
-        <w:t>Moderate-High Dose Range (BMD 6.0–10.0): Inflammation, Apoptosis, and Tissue Damage</w:t>
-      </w:r>
-    </w:p>
-    <w:p>
-      <w:pPr>
-        <w:spacing w:after="120"/>
-      </w:pPr>
-      <w:r>
-        <w:rPr>
-          <w:rFonts w:ascii="Calibri" w:hAnsi="Calibri"/>
-          <w:b/>
-          <w:sz w:val="22"/>
-        </w:rPr>
-        <w:t xml:space="preserve">Apoptosis: </w:t>
-      </w:r>
+        <w:pStyle w:val="ListBullet"/>
+        <w:spacing w:after="40"/>
+      </w:pPr>
       <w:r>
         <w:rPr>
           <w:rFonts w:ascii="Calibri" w:hAnsi="Calibri"/>
           <w:sz w:val="22"/>
         </w:rPr>
-        <w:t>pathways (path:hsa04210, median BMD 7.0) are fully engaged with 6 genes, and the BH3-only protein activation pathway (median BMD 5.75) indicates mitochondrial apoptotic commitment. The BAX/BCL2 ratio shift, combined with CASP3 upregulation, signals execution of the intrinsic apoptotic program.</w:t>
+        <w:t>**Toll-like receptor signaling** (path:hsa04620; median BMD 10.5), **NOD-like receptor signaling** (path:hsa04621; median BMD 10.5), **RIG-I-like receptor signaling** (path:hsa04622; median BMD 9.5), and **cytosolic DNA-sensing** (path:hsa04623; median BMD 11.0)—collectively indicating activation of innate immune pattern recognition receptors, likely in response to damage-associated molecular patterns (DAMPs) released from dying cells.</w:t>
       </w:r>
     </w:p>
     <w:p>
       <w:pPr>
-        <w:spacing w:after="120"/>
-      </w:pPr>
-      <w:r>
-        <w:rPr>
-          <w:rFonts w:ascii="Calibri" w:hAnsi="Calibri"/>
-          <w:b/>
-          <w:sz w:val="22"/>
-        </w:rPr>
-        <w:t xml:space="preserve">Pro-inflammatory cytokine signaling: </w:t>
-      </w:r>
+        <w:pStyle w:val="ListBullet"/>
+        <w:spacing w:after="40"/>
+      </w:pPr>
       <w:r>
         <w:rPr>
           <w:rFonts w:ascii="Calibri" w:hAnsi="Calibri"/>
           <w:sz w:val="22"/>
         </w:rPr>
-        <w:t>intensifies: **TNF**, **IL1B**, and **IL6** are upregulated at higher BMDs, driving NF-κB signaling (path:hsa04064, median BMD 9.5), TNF signaling (path:hsa04668, median BMD 10.0), and IL-17 signaling (path:hsa04657, median BMD 10.0). The **NLRP3 inflammasome** is activated, as evidenced by NLRP3 upregulation and the inflammasome pathway engagement (median BMD 12.0).</w:t>
+        <w:t>**Cytokine-cytokine receptor interaction** (path:hsa04060; median BMD 11.0) and **chemokine signaling** (path:hsa04062; median BMD 8.75) reflect systemic inflammatory signaling.</w:t>
       </w:r>
     </w:p>
     <w:p>
       <w:pPr>
-        <w:spacing w:after="120"/>
-      </w:pPr>
-      <w:r>
-        <w:rPr>
-          <w:rFonts w:ascii="Calibri" w:hAnsi="Calibri"/>
-          <w:b w:val="0"/>
-          <w:i w:val="0"/>
-          <w:sz w:val="22"/>
-        </w:rPr>
-        <w:t>The **AGE-RAGE signaling pathway in diabetic complications** (path:hsa04933, median BMD 8.75) involves 10 genes and reflects advanced glycation and inflammatory tissue damage. **Necroptosis** (path:hsa04217, median BMD 8.5) with 7 genes indicates that programmed necrotic cell death is occurring alongside apoptosis.</w:t>
-      </w:r>
-    </w:p>
-    <w:p>
-      <w:pPr>
-        <w:spacing w:after="120"/>
-      </w:pPr>
-      <w:r>
-        <w:rPr>
-          <w:rFonts w:ascii="Calibri" w:hAnsi="Calibri"/>
-          <w:b/>
-          <w:sz w:val="22"/>
-        </w:rPr>
-        <w:t xml:space="preserve">JAK-STAT signaling: </w:t>
-      </w:r>
+        <w:pStyle w:val="ListBullet"/>
+        <w:spacing w:after="40"/>
+      </w:pPr>
       <w:r>
         <w:rPr>
           <w:rFonts w:ascii="Calibri" w:hAnsi="Calibri"/>
           <w:sz w:val="22"/>
         </w:rPr>
-        <w:t>(path:hsa04630, median BMD 7.0) and **MAPK signaling** (path:hsa04010, median BMD 9.0) are activated, reflecting broad stress-responsive kinase cascades. The **senescence-associated secretory phenotype (SASP)** pathway (median BMD 10.25) indicates cellular senescence with pro-inflammatory cytokine secretion.</w:t>
+        <w:t>**Senescence-Associated Secretory Phenotype (SASP)** (median BMD 10.25) indicates cellular senescence, a terminal stress response associated with chronic inflammation and tissue dysfunction.</w:t>
       </w:r>
     </w:p>
     <w:p>
       <w:pPr>
-        <w:pStyle w:val="Heading3"/>
-      </w:pPr>
-      <w:r>
-        <w:t>High Dose Range (BMD 10.0–20.0): Immune Activation, Fibrosis, and Systemic Toxicity</w:t>
-      </w:r>
-    </w:p>
-    <w:p>
-      <w:pPr>
-        <w:spacing w:after="120"/>
-      </w:pPr>
-      <w:r>
-        <w:rPr>
-          <w:rFonts w:ascii="Calibri" w:hAnsi="Calibri"/>
-          <w:b w:val="0"/>
-          <w:i w:val="0"/>
-          <w:sz w:val="22"/>
-        </w:rPr>
-        <w:t>At the highest doses, **innate and adaptive immune pathways** dominate: Toll-like receptor signaling (path:hsa04620, median BMD 10.5), NOD-like receptor signaling (path:hsa04621, median BMD 10.5), RIG-I-like receptor signaling (path:hsa04622, median BMD 9.5), and cytokine-cytokine receptor interaction (path:hsa04060, median BMD 11.0). These reflect a systemic inflammatory state with immune cell recruitment and activation.</w:t>
-      </w:r>
-    </w:p>
-    <w:p>
-      <w:pPr>
-        <w:spacing w:after="120"/>
-      </w:pPr>
-      <w:r>
-        <w:rPr>
-          <w:rFonts w:ascii="Calibri" w:hAnsi="Calibri"/>
-          <w:b/>
-          <w:sz w:val="22"/>
-        </w:rPr>
-        <w:t xml:space="preserve">TGFB1: </w:t>
-      </w:r>
+        <w:pStyle w:val="ListBullet"/>
+        <w:spacing w:after="40"/>
+      </w:pPr>
       <w:r>
         <w:rPr>
           <w:rFonts w:ascii="Calibri" w:hAnsi="Calibri"/>
           <w:sz w:val="22"/>
         </w:rPr>
-        <w:t>upregulation drives fibrotic signaling through TGF-beta (path:hsa04350, median BMD 12.5) and contributes to tissue remodeling. The inflammatory bowel disease pathway (path:hsa05321, median BMD 10.5) and rheumatoid arthritis pathway (path:hsa05323, median BMD 11.0) reflect chronic inflammatory tissue damage patterns.</w:t>
+        <w:t>Multiple **infectious disease pathways** (hepatitis B/C, tuberculosis, Salmonella, etc.) are enriched at high BMDs, reflecting the engagement of generic immune/inflammatory gene modules rather than actual infection—a common pattern in toxicogenomic analyses where inflammatory cascades overlap with pathogen response pathways.</w:t>
       </w:r>
     </w:p>
     <w:p>
       <w:pPr>
-        <w:spacing w:after="120"/>
-      </w:pPr>
-      <w:r>
-        <w:rPr>
-          <w:rFonts w:ascii="Calibri" w:hAnsi="Calibri"/>
-          <w:b/>
-          <w:sz w:val="22"/>
-        </w:rPr>
-        <w:t xml:space="preserve">Neurodegenerative disease pathways: </w:t>
-      </w:r>
+        <w:pStyle w:val="ListBullet"/>
+        <w:spacing w:after="40"/>
+      </w:pPr>
       <w:r>
         <w:rPr>
           <w:rFonts w:ascii="Calibri" w:hAnsi="Calibri"/>
           <w:sz w:val="22"/>
         </w:rPr>
-        <w:t>are activated at moderate-to-high doses: Alzheimer's disease (path:hsa05010, median BMD 10.0), Parkinson's disease (path:hsa05012, median BMD 5.0), amyotrophic lateral sclerosis (path:hsa05014, median BMD 5.75), and Huntington's disease (path:hsa05016, median BMD 6.0), reflecting mitochondrial dysfunction and neuronal stress.</w:t>
+        <w:t>**Neurodegenerative disease pathways** (Alzheimer's, Parkinson's, Huntington's; BMD 10.0) are enriched, driven by shared genes in oxidative stress, mitochondrial dysfunction, and neuroinflammation (BAX, BCL2, CASP3, SOD1, SOD2, IL1B, TNF).</w:t>
       </w:r>
     </w:p>
     <w:p>
@@ -404,7 +478,7 @@
         <w:pStyle w:val="Heading3"/>
       </w:pPr>
       <w:r>
-        <w:t>Primary Target Organs</w:t>
+        <w:t>2.1 Liver (Highest Confidence Target)</w:t>
       </w:r>
     </w:p>
     <w:p>
@@ -415,10 +489,264 @@
         <w:rPr>
           <w:rFonts w:ascii="Calibri" w:hAnsi="Calibri"/>
           <w:b/>
-          <w:i w:val="0"/>
           <w:sz w:val="22"/>
         </w:rPr>
-        <w:t>Liver (Highest Confidence)</w:t>
+        <w:t xml:space="preserve">Evidence:: </w:t>
+      </w:r>
+      <w:r>
+        <w:rPr>
+          <w:rFonts w:ascii="Calibri" w:hAnsi="Calibri"/>
+          <w:sz w:val="22"/>
+        </w:rPr>
+        <w:t>The liver shows the broadest gene coverage in the organ signature analysis, with 32+ genes enriched across hepatic tissues (liver, hepatic Kupffer cells, hepatic system, liver microsomes). Key hepatic genes include the complete NRF2 battery (NFE2L2, KEAP1, NQO1, HMOX1, GCLC), xenobiotic metabolism genes (AHR, CYP1A1, CYP1B1, CYP3A4), inflammatory mediators (IL1B, IL6, TNF, NLRP3, NFKB1), and apoptotic regulators (BAX, BCL2, CASP3, TP53).</w:t>
+      </w:r>
+    </w:p>
+    <w:p>
+      <w:pPr>
+        <w:spacing w:after="120"/>
+      </w:pPr>
+      <w:r>
+        <w:rPr>
+          <w:rFonts w:ascii="Calibri" w:hAnsi="Calibri"/>
+          <w:b/>
+          <w:sz w:val="22"/>
+        </w:rPr>
+        <w:t xml:space="preserve">Mechanistic rationale:: </w:t>
+      </w:r>
+      <w:r>
+        <w:rPr>
+          <w:rFonts w:ascii="Calibri" w:hAnsi="Calibri"/>
+          <w:sz w:val="22"/>
+        </w:rPr>
+        <w:t>The liver is the primary site of xenobiotic metabolism. AHR-mediated induction of CYP1A1/CYP1B1 generates reactive metabolites that deplete glutathione (reflected by GCLC upregulation) and produce ROS, activating the NRF2 pathway. When oxidative stress exceeds the adaptive capacity, hepatocyte injury ensues, activating NLRP3 inflammasome in Kupffer cells and triggering IL1B/TNF-mediated inflammation. The literature directly supports this: "NLRP3 inflammasome activation plays a critical role in liver injury and disease progression" (NLRP3 Inflammasome Activation in Liver Disorders, 2025), and "A novel mechanism of hepatotoxicity involving endoplasmic reticulum stress and Nrf2 activation is identified" (Toxicogenomic module associations with pathogenesis, 2017).</w:t>
+      </w:r>
+    </w:p>
+    <w:p>
+      <w:pPr>
+        <w:spacing w:after="120"/>
+      </w:pPr>
+      <w:r>
+        <w:rPr>
+          <w:rFonts w:ascii="Calibri" w:hAnsi="Calibri"/>
+          <w:b/>
+          <w:sz w:val="22"/>
+        </w:rPr>
+        <w:t xml:space="preserve">Predicted phenotype:: </w:t>
+      </w:r>
+      <w:r>
+        <w:rPr>
+          <w:rFonts w:ascii="Calibri" w:hAnsi="Calibri"/>
+          <w:sz w:val="22"/>
+        </w:rPr>
+        <w:t>Hepatocellular injury progressing from centrilobular hypertrophy (adaptive CYP induction) → oxidative stress and steatosis → inflammatory infiltration → apoptosis/necrosis → fibrosis (TGFB1-mediated).</w:t>
+      </w:r>
+    </w:p>
+    <w:p>
+      <w:pPr>
+        <w:pStyle w:val="Heading3"/>
+      </w:pPr>
+      <w:r>
+        <w:t>2.2 Kidney (High Confidence Target)</w:t>
+      </w:r>
+    </w:p>
+    <w:p>
+      <w:pPr>
+        <w:spacing w:after="120"/>
+      </w:pPr>
+      <w:r>
+        <w:rPr>
+          <w:rFonts w:ascii="Calibri" w:hAnsi="Calibri"/>
+          <w:b/>
+          <w:sz w:val="22"/>
+        </w:rPr>
+        <w:t xml:space="preserve">Evidence:: </w:t>
+      </w:r>
+      <w:r>
+        <w:rPr>
+          <w:rFonts w:ascii="Calibri" w:hAnsi="Calibri"/>
+          <w:sz w:val="22"/>
+        </w:rPr>
+        <w:t>The kidney shows enrichment of 31+ genes, including the full complement of oxidative stress, inflammatory, and apoptotic markers. Specific renal signatures include enrichment in renal tubular epithelium (HMOX1), epithelial proximal cells (NFKB1), and glomerular mesangial cells (NFKB1). HAVCR1 (KIM-1), a highly specific biomarker of proximal tubular injury, is among the responsive genes in the xenobiotic stimulus GO term.</w:t>
+      </w:r>
+    </w:p>
+    <w:p>
+      <w:pPr>
+        <w:spacing w:after="120"/>
+      </w:pPr>
+      <w:r>
+        <w:rPr>
+          <w:rFonts w:ascii="Calibri" w:hAnsi="Calibri"/>
+          <w:b/>
+          <w:sz w:val="22"/>
+        </w:rPr>
+        <w:t xml:space="preserve">Mechanistic rationale:: </w:t>
+      </w:r>
+      <w:r>
+        <w:rPr>
+          <w:rFonts w:ascii="Calibri" w:hAnsi="Calibri"/>
+          <w:sz w:val="22"/>
+        </w:rPr>
+        <w:t>The kidney concentrates xenobiotics and their metabolites during excretion, making proximal tubular epithelium particularly vulnerable to oxidative damage. The literature supports this: "Rutin (RUT) protects against liver and kidney damage caused by valproic acid (VLP) in rats" (Rutin Protects from Destruction, 2021), and "Lead exposure triggers ferroptotic hepatocellular death" with associated renal effects (Lead Exposure Triggers Ferroptotic Hepatocellular Death, 2026).</w:t>
+      </w:r>
+    </w:p>
+    <w:p>
+      <w:pPr>
+        <w:spacing w:after="120"/>
+      </w:pPr>
+      <w:r>
+        <w:rPr>
+          <w:rFonts w:ascii="Calibri" w:hAnsi="Calibri"/>
+          <w:b/>
+          <w:sz w:val="22"/>
+        </w:rPr>
+        <w:t xml:space="preserve">Predicted phenotype:: </w:t>
+      </w:r>
+      <w:r>
+        <w:rPr>
+          <w:rFonts w:ascii="Calibri" w:hAnsi="Calibri"/>
+          <w:sz w:val="22"/>
+        </w:rPr>
+        <w:t>Proximal tubular injury with oxidative stress, progressing to tubular necrosis and interstitial inflammation at higher doses.</w:t>
+      </w:r>
+    </w:p>
+    <w:p>
+      <w:pPr>
+        <w:pStyle w:val="Heading3"/>
+      </w:pPr>
+      <w:r>
+        <w:t>2.3 Testis and Male Reproductive System (High Confidence Target)</w:t>
+      </w:r>
+    </w:p>
+    <w:p>
+      <w:pPr>
+        <w:spacing w:after="120"/>
+      </w:pPr>
+      <w:r>
+        <w:rPr>
+          <w:rFonts w:ascii="Calibri" w:hAnsi="Calibri"/>
+          <w:b/>
+          <w:sz w:val="22"/>
+        </w:rPr>
+        <w:t xml:space="preserve">Evidence:: </w:t>
+      </w:r>
+      <w:r>
+        <w:rPr>
+          <w:rFonts w:ascii="Calibri" w:hAnsi="Calibri"/>
+          <w:sz w:val="22"/>
+        </w:rPr>
+        <w:t>Testis/testes show enrichment of 19–21 genes, with specific signatures in spermatocytes (SIRT1, TP53), cauda epididymis (GCLC, HMOX1, NFE2L2, NQO1), and sperm. The complete oxidative stress defense battery, apoptotic machinery, and inflammatory mediators are represented.</w:t>
+      </w:r>
+    </w:p>
+    <w:p>
+      <w:pPr>
+        <w:spacing w:after="120"/>
+      </w:pPr>
+      <w:r>
+        <w:rPr>
+          <w:rFonts w:ascii="Calibri" w:hAnsi="Calibri"/>
+          <w:b/>
+          <w:sz w:val="22"/>
+        </w:rPr>
+        <w:t xml:space="preserve">Mechanistic rationale:: </w:t>
+      </w:r>
+      <w:r>
+        <w:rPr>
+          <w:rFonts w:ascii="Calibri" w:hAnsi="Calibri"/>
+          <w:sz w:val="22"/>
+        </w:rPr>
+        <w:t>Spermatogenesis is exquisitely sensitive to oxidative stress. AHR activation in testicular tissue can directly impair spermatogenesis, while ROS-mediated damage to spermatocytes triggers TP53-dependent apoptosis. The literature confirms: "The RuIII/Q complex has potent antioxidant and anti-inflammatory effects, reducing oxidative stress and apoptosis in testicular and brain tissues" (Potential Therapeutic Effects of New Ruthenium (III) Complex, 2021), and AHR is specifically enriched in male reproductive organs.</w:t>
+      </w:r>
+    </w:p>
+    <w:p>
+      <w:pPr>
+        <w:spacing w:after="120"/>
+      </w:pPr>
+      <w:r>
+        <w:rPr>
+          <w:rFonts w:ascii="Calibri" w:hAnsi="Calibri"/>
+          <w:b/>
+          <w:sz w:val="22"/>
+        </w:rPr>
+        <w:t xml:space="preserve">Predicted phenotype:: </w:t>
+      </w:r>
+      <w:r>
+        <w:rPr>
+          <w:rFonts w:ascii="Calibri" w:hAnsi="Calibri"/>
+          <w:sz w:val="22"/>
+        </w:rPr>
+        <w:t>Spermatocyte apoptosis, reduced sperm quality, testicular oxidative stress, and potential endocrine disruption.</w:t>
+      </w:r>
+    </w:p>
+    <w:p>
+      <w:pPr>
+        <w:pStyle w:val="Heading3"/>
+      </w:pPr>
+      <w:r>
+        <w:t>2.4 Brain and Central Nervous System (High Confidence Target)</w:t>
+      </w:r>
+    </w:p>
+    <w:p>
+      <w:pPr>
+        <w:spacing w:after="120"/>
+      </w:pPr>
+      <w:r>
+        <w:rPr>
+          <w:rFonts w:ascii="Calibri" w:hAnsi="Calibri"/>
+          <w:b/>
+          <w:sz w:val="22"/>
+        </w:rPr>
+        <w:t xml:space="preserve">Evidence:: </w:t>
+      </w:r>
+      <w:r>
+        <w:rPr>
+          <w:rFonts w:ascii="Calibri" w:hAnsi="Calibri"/>
+          <w:sz w:val="22"/>
+        </w:rPr>
+        <w:t>Brain tissue shows enrichment of 27+ genes across multiple CNS subregions: substantia nigra (9 genes including BAX, HMOX1, IL1B, IL6, NFE2L2, SOD1, SOD2, TNF), microglia (10+ genes), hippocampus, prefrontal cortex, spinal cord, and dorsal root ganglia. The neurodegenerative disease pathways (Alzheimer's, Parkinson's) are significantly enriched.</w:t>
+      </w:r>
+    </w:p>
+    <w:p>
+      <w:pPr>
+        <w:spacing w:after="120"/>
+      </w:pPr>
+      <w:r>
+        <w:rPr>
+          <w:rFonts w:ascii="Calibri" w:hAnsi="Calibri"/>
+          <w:b/>
+          <w:sz w:val="22"/>
+        </w:rPr>
+        <w:t xml:space="preserve">Mechanistic rationale:: </w:t>
+      </w:r>
+      <w:r>
+        <w:rPr>
+          <w:rFonts w:ascii="Calibri" w:hAnsi="Calibri"/>
+          <w:sz w:val="22"/>
+        </w:rPr>
+        <w:t>Microglial activation is a central mechanism of neurotoxicity. The gene signature (HMOX1, NFE2L2, NQO1, IL1B, IL6, NLRP3, SIRT1, TNF in microglia) is consistent with microglial polarization toward a pro-inflammatory phenotype. "ROS Generation in Microglia: Understanding Oxidative Stress and Inflammation in Neurodegenerative Disease" (2020) directly supports this mechanism. The blood-brain barrier signature (HMOX1, NFE2L2, SIRT1) and blood-brain barrier disru</w:t>
+      </w:r>
+    </w:p>
+    <w:p>
+      <w:pPr>
+        <w:pStyle w:val="Heading1"/>
+      </w:pPr>
+      <w:r>
+        <w:t>Run 2 (79.0s)</w:t>
+      </w:r>
+    </w:p>
+    <w:p>
+      <w:pPr>
+        <w:pStyle w:val="Heading2"/>
+      </w:pPr>
+      <w:r>
+        <w:t>Comprehensive Toxicogenomic Interpretation Report</w:t>
+      </w:r>
+    </w:p>
+    <w:p>
+      <w:pPr>
+        <w:pStyle w:val="Heading2"/>
+      </w:pPr>
+      <w:r>
+        <w:t>Executive Summary</w:t>
       </w:r>
     </w:p>
     <w:p>
@@ -432,191 +760,7 @@
           <w:i w:val="0"/>
           <w:sz w:val="22"/>
         </w:rPr>
-        <w:t>The liver emerges as the primary target organ based on multiple converging lines of evidence. The organ signature analysis identifies 31+ responsive genes with liver annotation, the highest gene count of any organ. The AHR-CYP1A1/CYP1B1 axis is a canonical hepatic xenobiotic metabolism pathway, and AHR has been validated as a quantitative transcriptional biomarker for drug-induced liver injury (DILI) prediction (Quantitative Transcriptional Biomarkers of Xenobiotic Receptor Activation, 2020). The NRF2-KEAP1-NQO1-HMOX1-GCLC pathway is a well-characterized hepatoprotective response that, when overwhelmed, transitions to hepatotoxicity. NFE2L2 activation has been specifically linked to a "novel mechanism of hepatotoxicity involving endoplasmic reticulum stress and Nrf2 activation" (Toxicogenomic module associations with pathogenesis, 2017). PPARA activation is a liver-specific response associated with lipid metabolism perturbation (Fenofibrate differentially activates PPARα-mediated lipid metabolism, 2025). The hepatocellular carcinoma pathway (path:hsa05225) is activated at a relatively low median BMD of 2.65, and cadmium-induced toxicity in hepatic macrophages (Kupffer cells) specifically involves NF-κB and NRF2 activation (Research Advances on Cadmium-Induced Toxicity in Hepatic Macrophages, 2026). The enrichment of HMOX1 in hepatic Kupffer cells (671.56× enrichment) further supports hepatic immune-mediated injury.</w:t>
-      </w:r>
-    </w:p>
-    <w:p>
-      <w:pPr>
-        <w:spacing w:after="120"/>
-      </w:pPr>
-      <w:r>
-        <w:rPr>
-          <w:rFonts w:ascii="Calibri" w:hAnsi="Calibri"/>
-          <w:b/>
-          <w:i w:val="0"/>
-          <w:sz w:val="22"/>
-        </w:rPr>
-        <w:t>Kidney (High Confidence)</w:t>
-      </w:r>
-    </w:p>
-    <w:p>
-      <w:pPr>
-        <w:spacing w:after="120"/>
-      </w:pPr>
-      <w:r>
-        <w:rPr>
-          <w:rFonts w:ascii="Calibri" w:hAnsi="Calibri"/>
-          <w:b w:val="0"/>
-          <w:i w:val="0"/>
-          <w:sz w:val="22"/>
-        </w:rPr>
-        <w:t>The kidney is the second most likely target organ, with 26+ responsive genes annotated to renal tissue. HMOX1 enrichment in renal tubular epithelium (671.56×) indicates tubular injury responses. The gene expression pattern—including BAX, BCL2, CASP3, CDKN1A, CYP1A1, CYP1B1, GCLC, GPX1, HMOX1, NFE2L2, NFKB1, NQO1, SOD1, SOD2, TGFB1, TNF, TP53, and VEGFA—recapitulates known nephrotoxicity signatures. Nanocurcumin modulation of VEGF and AhR pathways in doxorubicin-induced nephrotoxicity (Aryl Hydrocarbon Receptor and Vascular Endothelial Growth Factor, 2026) directly supports the relevance of these pathways to renal injury. The AGE-RAGE pathway in diabetic complications (median BMD 8.75) is particularly relevant to renal pathology.</w:t>
-      </w:r>
-    </w:p>
-    <w:p>
-      <w:pPr>
-        <w:spacing w:after="120"/>
-      </w:pPr>
-      <w:r>
-        <w:rPr>
-          <w:rFonts w:ascii="Calibri" w:hAnsi="Calibri"/>
-          <w:b/>
-          <w:i w:val="0"/>
-          <w:sz w:val="22"/>
-        </w:rPr>
-        <w:t>Brain/Central Nervous System (High Confidence)</w:t>
-      </w:r>
-    </w:p>
-    <w:p>
-      <w:pPr>
-        <w:spacing w:after="120"/>
-      </w:pPr>
-      <w:r>
-        <w:rPr>
-          <w:rFonts w:ascii="Calibri" w:hAnsi="Calibri"/>
-          <w:b w:val="0"/>
-          <w:i w:val="0"/>
-          <w:sz w:val="22"/>
-        </w:rPr>
-        <w:t>Neuronal tissues show extensive gene enrichment: neurons (184.68×, 11+ genes), brain tissue (447.71×), and neurodegenerative tissues (503.67×). The gene signature includes BAX, BCL2, CASP3, IL1B, IL6, NFE2L2, SIRT1, SOD1, SOD2, STAT3, TNF, and VEGFA—a pattern consistent with neuroinflammation and neuronal apoptosis. The GO term "negative regulation of neuron apoptotic process" (GO:0043524, 11 genes) and "neuron apoptotic process" (GO:0051402, 7 genes) directly implicate neuronal cell death. Cadmium-induced neurotoxicity through disruption of essential metal homeostasis (Neuronal specific and non-specific responses to cadmium, 2019) and heavy metal interference with antioxidant defense in brain tissue (Heavy metals: toxicity and human health effects, 2024) provide mechanistic support. The substantia nigra enrichment (268.62×, BAX and TP53) specifically suggests vulnerability of dopaminergic neurons, consistent with Parkinson's disease pathway activation.</w:t>
-      </w:r>
-    </w:p>
-    <w:p>
-      <w:pPr>
-        <w:spacing w:after="120"/>
-      </w:pPr>
-      <w:r>
-        <w:rPr>
-          <w:rFonts w:ascii="Calibri" w:hAnsi="Calibri"/>
-          <w:b/>
-          <w:i w:val="0"/>
-          <w:sz w:val="22"/>
-        </w:rPr>
-        <w:t>Heart (Moderate-High Confidence)</w:t>
-      </w:r>
-    </w:p>
-    <w:p>
-      <w:pPr>
-        <w:spacing w:after="120"/>
-      </w:pPr>
-      <w:r>
-        <w:rPr>
-          <w:rFonts w:ascii="Calibri" w:hAnsi="Calibri"/>
-          <w:b w:val="0"/>
-          <w:i w:val="0"/>
-          <w:sz w:val="22"/>
-        </w:rPr>
-        <w:t>Cardiac tissue shows enrichment of 26+ responsive genes. The pattern of BAX, BCL2, CASP3, CAT, CDKN1A, GDF15, GPX1, HMOX1, IL1B, IL6, KEAP1, NFE2L2, NFKB1, NQO1, SIRT1, SOD1, SOD2, STAT3, TGFB1, TNF, TP53, and VEGFA in heart tissue reflects oxidative stress-mediated cardiomyopathy. GDF15 enrichment in cardiac tissue is notable as a biomarker of cardiac stress. Whey protein protection against thioacetamide-induced cardiotoxicity through modulation of these same markers (The cardioprotective effect of whey protein, 2025) validates the cardiotoxic relevance of this gene signature. Cardiomyocyte gene programs involving NFE2L2 and TP53 have been linked to cardiac hypertrophy and failure (Cardiomyocyte gene programs encoding morphological and functional signatures, 2018).</w:t>
-      </w:r>
-    </w:p>
-    <w:p>
-      <w:pPr>
-        <w:pStyle w:val="Heading3"/>
-      </w:pPr>
-      <w:r>
-        <w:t>Secondary Target Organs</w:t>
-      </w:r>
-    </w:p>
-    <w:p>
-      <w:pPr>
-        <w:spacing w:after="120"/>
-      </w:pPr>
-      <w:r>
-        <w:rPr>
-          <w:rFonts w:ascii="Calibri" w:hAnsi="Calibri"/>
-          <w:b/>
-          <w:i w:val="0"/>
-          <w:sz w:val="22"/>
-        </w:rPr>
-        <w:t>Intestine/Gastrointestinal Tract (Moderate Confidence)</w:t>
-      </w:r>
-    </w:p>
-    <w:p>
-      <w:pPr>
-        <w:spacing w:after="120"/>
-      </w:pPr>
-      <w:r>
-        <w:rPr>
-          <w:rFonts w:ascii="Calibri" w:hAnsi="Calibri"/>
-          <w:b w:val="0"/>
-          <w:i w:val="0"/>
-          <w:sz w:val="22"/>
-        </w:rPr>
-        <w:t>The ileum (503.67×, 6 genes including HMOX1, KEAP1, NFE2L2, NQO1, SIRT1, SOD1) and intestine (172.69×, 18+ genes) show substantial enrichment. Oyster peptide protection against intestinal oxidative damage through the KEAP1-NRF2 pathway (Protective Effect of Oyster Peptides, 2022) supports intestinal vulnerability. The inflammatory bowel disease pathway activation at high doses further implicates gastrointestinal injury.</w:t>
-      </w:r>
-    </w:p>
-    <w:p>
-      <w:pPr>
-        <w:spacing w:after="120"/>
-      </w:pPr>
-      <w:r>
-        <w:rPr>
-          <w:rFonts w:ascii="Calibri" w:hAnsi="Calibri"/>
-          <w:b/>
-          <w:i w:val="0"/>
-          <w:sz w:val="22"/>
-        </w:rPr>
-        <w:t>Testis/Reproductive Organs (Moderate Confidence)</w:t>
-      </w:r>
-    </w:p>
-    <w:p>
-      <w:pPr>
-        <w:spacing w:after="120"/>
-      </w:pPr>
-      <w:r>
-        <w:rPr>
-          <w:rFonts w:ascii="Calibri" w:hAnsi="Calibri"/>
-          <w:b w:val="0"/>
-          <w:i w:val="0"/>
-          <w:sz w:val="22"/>
-        </w:rPr>
-        <w:t>Testis enrichment (470.09×, 7 genes: BAX, BCL2, CASP3, CAT, GPX1, NFE2L2, TP53) and reproductive organ enrichment (503.67×) indicate gonadal toxicity potential. The RuIII/Q complex studies demonstrating amelioration of reproductive toxicity through modulation of these same genes (Potential Therapeutic Effects of New Ruthenium (III) Complex, 2021) provide direct mechanistic support.</w:t>
-      </w:r>
-    </w:p>
-    <w:p>
-      <w:pPr>
-        <w:spacing w:after="120"/>
-      </w:pPr>
-      <w:r>
-        <w:rPr>
-          <w:rFonts w:ascii="Calibri" w:hAnsi="Calibri"/>
-          <w:b/>
-          <w:i w:val="0"/>
-          <w:sz w:val="22"/>
-        </w:rPr>
-        <w:t>Lung (Moderate Confidence)</w:t>
-      </w:r>
-    </w:p>
-    <w:p>
-      <w:pPr>
-        <w:spacing w:after="120"/>
-      </w:pPr>
-      <w:r>
-        <w:rPr>
-          <w:rFonts w:ascii="Calibri" w:hAnsi="Calibri"/>
-          <w:b w:val="0"/>
-          <w:i w:val="0"/>
-          <w:sz w:val="22"/>
-        </w:rPr>
-        <w:t>Lung tissue (287.81×) and lung epithel</w:t>
-      </w:r>
-    </w:p>
-    <w:p>
-      <w:pPr>
-        <w:pStyle w:val="Heading1"/>
-      </w:pPr>
-      <w:r>
-        <w:t>Run 2 (80.3s)</w:t>
+        <w:t>This dose-response analysis reveals a coherent toxicological signature involving 32 responsive genes (27 upregulated, 5 downregulated) across a BMD range of 0.2–20 dose units. The transcriptomic profile is dominated by activation of the KEAP1-NRF2 antioxidant defense system at the lowest doses, followed by progressive engagement of inflammatory (NF-κB, NLRP3 inflammasome), apoptotic (TP53, BAX/BCL2/CASP3), and pro-fibrotic (TGFB1) signaling cascades at higher doses. The gene expression signature is consistent with a xenobiotic-induced oxidative stress response that transitions from adaptive cytoprotection to overt tissue injury, with the inflection point estimated at approximately BMD 3–5. Multi-organ vulnerability is predicted, with liver, kidney, testis, brain, and cardiovascular tissues as primary targets.</w:t>
       </w:r>
     </w:p>
     <w:p>
@@ -638,7 +782,15 @@
         <w:pStyle w:val="Heading2"/>
       </w:pPr>
       <w:r>
-        <w:t>1. Biological Response Narrative</w:t>
+        <w:t>1. Biological Response Narrative: Dose-Ordered Progression of Effects</w:t>
+      </w:r>
+    </w:p>
+    <w:p>
+      <w:pPr>
+        <w:pStyle w:val="Heading3"/>
+      </w:pPr>
+      <w:r>
+        <w:t>Ultra-Low Dose Range (BMD 0.2–0.5): Xenobiotic Sensing and Phase I/II Metabolism</w:t>
       </w:r>
     </w:p>
     <w:p>
@@ -652,15 +804,7 @@
           <w:i w:val="0"/>
           <w:sz w:val="22"/>
         </w:rPr>
-        <w:t>The 32 responsive genes (27 upregulated, 5 downregulated) across a BMD range of 0.2–20 reveal a coherent, dose-dependent progression from early adaptive cytoprotection to overt cellular damage, inflammation, and pro-apoptotic signaling.</w:t>
-      </w:r>
-    </w:p>
-    <w:p>
-      <w:pPr>
-        <w:pStyle w:val="Heading3"/>
-      </w:pPr>
-      <w:r>
-        <w:t>Ultra-Low Dose Range (BMD 0.2–0.55): Xenobiotic Sensing and Cytoprotective Activation</w:t>
+        <w:t>The earliest transcriptional responses occur in the aryl hydrocarbon receptor (AHR) signaling axis. AHR, CYP1A1, and CYP1B1 are among the first genes to respond (median BMD ~0.35), indicating that the compound or its metabolites engage the AHR as a molecular sensor. This is consistent with the enrichment of the "Chemical carcinogenesis – receptor activation" pathway (path:hsa05208/rno05208, median BMD 0.5, 9 genes). Concurrently, the KEAP1-NFE2L2 (NRF2) axis is activated, with NFE2L2 and KEAP1 responding at BMD 0.3–0.55. The upregulation of NRF2-target genes NQO1, HMOX1, and GCLC at BMDs of 0.4–0.87 confirms engagement of the electrophile response element (EpRE/ARE)-driven transcriptional program. The GO term "response to xenobiotic stimulus" (GO:0009410, FDR = 5.82 × 10⁻²⁶, 22 genes) is the most significantly enriched biological process, underscoring that the primary initiating event is xenobiotic recognition and detoxification.</w:t>
       </w:r>
     </w:p>
     <w:p>
@@ -674,7 +818,15 @@
           <w:i w:val="0"/>
           <w:sz w:val="22"/>
         </w:rPr>
-        <w:t>The earliest molecular events center on xenobiotic receptor activation and the oxidative stress defense axis. **Aryl hydrocarbon receptor (AHR) signaling** is the first pathway engaged (median BMD 0.35), with upregulation of AHR and its canonical transcriptional targets **CYP1A1** and **CYP1B1**. This represents the classical xenobiotic sensing response: ligand binding to AHR triggers nuclear translocation and induction of Phase I biotransformation enzymes. The chemical pathway for drug metabolism (path:hsa05208, median BMD 0.5) is activated concurrently, incorporating AHR, CYP1A1, and critically, the **KEAP1-NFE2L2 (NRF2)** axis along with downstream Phase II detoxification genes **HMOX1** and **NQO1**.</w:t>
+        <w:t>At this dose range, the metabolic pathways (path:hsa01100/rno01100, median BMD 0.5) are also engaged, reflecting biosynthesis of cofactors for conjugation reactions (path:hsa01240/rno01240, median BMD 0.55), including glutathione precursor synthesis via GCLC. This phase represents a canonical adaptive response: the organism detects the xenobiotic, activates phase I biotransformation (CYP1A1, CYP1B1), and simultaneously induces phase II detoxification and antioxidant defenses (NQO1, HMOX1, GCLC, GPX1, SOD1, SOD2, CAT) to neutralize reactive metabolites and reactive oxygen species (ROS).</w:t>
+      </w:r>
+    </w:p>
+    <w:p>
+      <w:pPr>
+        <w:pStyle w:val="Heading3"/>
+      </w:pPr>
+      <w:r>
+        <w:t>Low Dose Range (BMD 0.5–2.0): Ferroptosis Defense and Early Stress Signaling</w:t>
       </w:r>
     </w:p>
     <w:p>
@@ -688,7 +840,7 @@
           <w:i w:val="0"/>
           <w:sz w:val="22"/>
         </w:rPr>
-        <w:t>At BMD 0.3–0.55, the **NRF2-mediated nuclear events** and **GSK3B/BTRC:CUL1-mediated degradation of NFE2L2** pathways show mixed directionality, suggesting that while NRF2 transcriptional activity is being induced, regulatory feedback through KEAP1-dependent degradation is simultaneously engaged. The upregulation of **NFE2L2** itself, alongside **NQO1**, **HMOX1**, and **GCLC** (glutamate-cysteine ligase catalytic subunit), indicates robust activation of the antioxidant response element (ARE)-driven gene battery. This is a hallmark adaptive response to electrophilic or oxidative stress.</w:t>
+        <w:t>As dose increases, ferroptosis-related pathways (path:hsa04216/rno04216, median BMD 0.6, 3 genes) are activated, suggesting that lipid peroxidation is an early consequence of oxidative stress. The upregulation of GPX1 and the antioxidant enzyme battery (SOD1, SOD2, CAT) at this range reflects an intensification of the cellular defense against ROS-mediated damage. The "response to oxidative stress" GO term (GO:0006979, 12 genes) and "response to hydrogen peroxide" (GO:0042542, 8 genes) confirm that oxidative stress is a central feature of the toxicological response.</w:t>
       </w:r>
     </w:p>
     <w:p>
@@ -702,7 +854,7 @@
           <w:i w:val="0"/>
           <w:sz w:val="22"/>
         </w:rPr>
-        <w:t>Metabolic pathway engagement (path:rno01100, median BMD 0.5) at this stage likely reflects the metabolic cost of Phase I/II enzyme induction and glutathione biosynthesis (GCLC upregulation).</w:t>
+        <w:t>The "GSK3B and BTRC:CUL1-mediated degradation of NFE2L2" pathway (median BMD 0.55, mixed direction) indicates that regulatory feedback on NRF2 protein stability is already engaged, with KEAP1 upregulation potentially reflecting a compensatory attempt to restrain NRF2 hyperactivation—or, alternatively, a response to sustained electrophilic stress that overwhelms the KEAP1 degradation machinery.</w:t>
       </w:r>
     </w:p>
     <w:p>
@@ -710,7 +862,7 @@
         <w:pStyle w:val="Heading3"/>
       </w:pPr>
       <w:r>
-        <w:t>Low Dose Range (BMD 0.4–2.0): Ferroptosis Signaling and Early Stress Responses</w:t>
+        <w:t>Transitional Dose Range (BMD 2.0–4.0): Circadian Disruption, ER Stress, and Emerging Inflammation</w:t>
       </w:r>
     </w:p>
     <w:p>
@@ -724,7 +876,7 @@
           <w:i w:val="0"/>
           <w:sz w:val="22"/>
         </w:rPr>
-        <w:t>Between BMD 0.4 and 2.0, **ferroptosis signaling** (path:hsa04216, median BMD 0.6) emerges, with upregulation of genes including those involved in iron-dependent lipid peroxidation defense. The engagement of **GPX1** (glutathione peroxidase 1), **SOD1**, **SOD2**, and **CAT** across this range indicates that the cell is mounting a comprehensive antioxidant defense against reactive oxygen species (ROS), including superoxide and hydrogen peroxide.</w:t>
+        <w:t>A notable finding is the downregulation of circadian clock genes at BMD 2.0–2.25 (path:hsa04922/rno04922, mostly DOWN). Circadian disruption is increasingly recognized as a hallmark of metabolic and oxidative stress in liver and other tissues, and the suppression of circadian regulators at this dose suggests that the homeostatic capacity of the cell is beginning to be overwhelmed.</w:t>
       </w:r>
     </w:p>
     <w:p>
@@ -738,15 +890,7 @@
           <w:i w:val="0"/>
           <w:sz w:val="22"/>
         </w:rPr>
-        <w:t>At BMD ~2.0–2.25, a notable shift occurs: **circadian clock genes** and **glucocorticoid receptor signaling** (path:hsa04922) show predominantly **downregulated** expression. Disruption of circadian transcriptional programs is increasingly recognized as an early indicator of cellular stress that precedes overt toxicity, and may reflect HIF1A-mediated metabolic reprogramming competing with circadian transcription factor binding.</w:t>
-      </w:r>
-    </w:p>
-    <w:p>
-      <w:pPr>
-        <w:pStyle w:val="Heading3"/>
-      </w:pPr>
-      <w:r>
-        <w:t>Transitional Dose Range (BMD 2.5–4.0): Emergence of Pro-Survival and Damage Signals</w:t>
+        <w:t>Endoplasmic reticulum (ER) protein processing pathways (path:hsa04141/rno04141, median BMD 5.5 but with gene responses starting at BMD 0.3) and mitophagy (path:hsa04137/rno04137, median BMD 3.5) are activated, indicating that protein misfolding and mitochondrial damage are emerging as secondary consequences of sustained oxidative stress. Autophagy pathways (path:hsa04140/rno04140, median BMD 3.5) are upregulated, consistent with SQSTM1 (p62) induction—a known NRF2 target and autophagy receptor that links oxidative stress to selective autophagy.</w:t>
       </w:r>
     </w:p>
     <w:p>
@@ -760,7 +904,15 @@
           <w:i w:val="0"/>
           <w:sz w:val="22"/>
         </w:rPr>
-        <w:t>This range marks the critical transition from predominantly adaptive to mixed adaptive/adverse responses. **Hepatocellular carcinoma-related pathways** (path:hsa05225, median BMD 2.65) become enriched, reflecting activation of oncogenic signaling nodes including **STAT3**, **NFKB1**, **HIF1A**, and **VEGFA**. The **mitophagy** (path:hsa04137, median BMD 3.5) and **autophagy** (path:hsa04140, median BMD 3.5) pathways are upregulated, indicating that cells are engaging quality control mechanisms to remove damaged mitochondria and misfolded proteins—a response consistent with escalating oxidative damage overwhelming the primary antioxidant defenses.</w:t>
+        <w:t>The "Fluid shear stress and atherosclerosis" pathway (path:hsa05418/rno05418, median BMD 4.0, 11 genes) is significantly enriched, reflecting activation of endothelial stress responses involving NRF2, NF-κB, and pro-inflammatory cytokines. This marks the transition from purely adaptive to potentially adverse signaling.</w:t>
+      </w:r>
+    </w:p>
+    <w:p>
+      <w:pPr>
+        <w:pStyle w:val="Heading3"/>
+      </w:pPr>
+      <w:r>
+        <w:t>Moderate Dose Range (BMD 4.0–6.0): Apoptosis, p53 Activation, and Inflammatory Amplification</w:t>
       </w:r>
     </w:p>
     <w:p>
@@ -774,15 +926,7 @@
           <w:i w:val="0"/>
           <w:sz w:val="22"/>
         </w:rPr>
-        <w:t>The **fluid shear stress and atherosclerosis pathway** (path:hsa05418, median BMD 4.0) integrates oxidative stress (NFE2L2, HMOX1, NQO1), inflammation (IL1B, TNF, NFKB1), and cell death (TP53, BCL2) signals, suggesting that endothelial and vascular stress responses are being activated. **Wnt signaling** (path:hsa04310, median BMD 3.75) shows mixed directionality, potentially reflecting competing proliferative and growth-arrest signals.</w:t>
-      </w:r>
-    </w:p>
-    <w:p>
-      <w:pPr>
-        <w:pStyle w:val="Heading3"/>
-      </w:pPr>
-      <w:r>
-        <w:t>Moderate Dose Range (BMD 4.0–6.0): Inflammatory Cascade and Apoptotic Commitment</w:t>
+        <w:t>This dose range witnesses the activation of the TP53 signaling pathway (path:hsa04115/rno04115, median BMD 5.5), with TP53, CDKN1A (p21), BAX, and CASP3 all upregulated. The GO terms "positive regulation of apoptotic process" (GO:0043065, 15 genes) and "neuron apoptotic process" (GO:0051402, 7 genes) confirm that programmed cell death is now a significant component of the response. The "TP53 Regulates Transcription of Cell Cycle Genes" (median BMD 5.25) and "TP53 Regulates Transcription of Cell Death Genes" (median BMD 5.75) Reactome pathways further delineate the dual role of p53 in cell cycle arrest (via CDKN1A) and apoptosis induction (via BAX).</w:t>
       </w:r>
     </w:p>
     <w:p>
@@ -796,7 +940,7 @@
           <w:i w:val="0"/>
           <w:sz w:val="22"/>
         </w:rPr>
-        <w:t>This dose range witnesses a dramatic expansion of adverse signaling. The **TP53 signaling pathway** (path:hsa04115, median BMD 5.5) is robustly activated, with upregulation of **TP53**, **CDKN1A** (p21), **BAX**, and **CASP3**, indicating engagement of the DNA damage response and commitment to cell cycle arrest and apoptosis. The concurrent upregulation of **TP53 Regulates Transcription of Cell Cycle Genes** (median BMD 5.25) and **TP53 Regulates Transcription of Cell Death Genes** (median BMD 5.75) confirms that p53 is functioning as a master regulator of the damage response at these doses.</w:t>
+        <w:t>The "Pathways in cancer" (path:hsa05200/rno05200, median BMD 5.0, 15 genes) is the most significantly enriched KEGG pathway (FDR = 4.80 × 10⁻³⁶), reflecting the convergence of proliferative, survival, and death signaling through HIF1A, VEGFA, STAT3, BCL2, and NFKB1. The simultaneous upregulation of both pro-apoptotic (BAX, CASP3) and anti-apoptotic (BCL2) genes suggests a state of active cellular decision-making, where the balance between survival and death is being contested.</w:t>
       </w:r>
     </w:p>
     <w:p>
@@ -810,35 +954,15 @@
           <w:i w:val="0"/>
           <w:sz w:val="22"/>
         </w:rPr>
-        <w:t>The **pathways in cancer** (path:hsa05200, median BMD 5.0) become the most significantly enriched pathway (p = 5.92 × 10⁻³⁸), incorporating 15 of 26 responsive genes. This reflects not oncogenic transformation per se, but rather the activation of the same signaling hubs—**STAT3**, **NFKB1**, **HIF1A**, **VEGFA**, **TP53**, **BCL2/BAX**—that are co-opted in carcinogenesis. The **PI3K-AKT signaling pathway** (path:hsa04151, median BMD 5.25) and **HIF-1 signaling** (path:hsa04066, median BMD 5.0) indicate hypoxia-responsive and pro-survival signaling, likely reflecting tissue-level oxygen demand changes secondary to vascular and inflammatory perturbations.</w:t>
+        <w:t>The PI3K-Akt signaling pathway (path:hsa04151/rno04151, median BMD 5.25) and HIF-1 signaling pathway (path:hsa04066/rno04066, median BMD 5.0) are activated, with HIF1A and VEGFA upregulation indicating a hypoxic or pseudo-hypoxic response—likely secondary to mitochondrial dysfunction and ROS accumulation. The GO term "response to hypoxia" (GO:0001666, 15 genes) supports this interpretation.</w:t>
       </w:r>
     </w:p>
     <w:p>
       <w:pPr>
-        <w:spacing w:after="120"/>
+        <w:pStyle w:val="Heading3"/>
       </w:pPr>
       <w:r>
-        <w:rPr>
-          <w:rFonts w:ascii="Calibri" w:hAnsi="Calibri"/>
-          <w:b/>
-          <w:sz w:val="22"/>
-        </w:rPr>
-        <w:t xml:space="preserve">Apoptosis: </w:t>
-      </w:r>
-      <w:r>
-        <w:rPr>
-          <w:rFonts w:ascii="Calibri" w:hAnsi="Calibri"/>
-          <w:sz w:val="22"/>
-        </w:rPr>
-        <w:t>(path:hsa04210, median BMD 7.0) and **cellular senescence** (path:hsa04218, median BMD 5.0) pathways are now fully engaged. The **Activation of BH3-only proteins** (median BMD 5.75) with mixed directionality (BAX up, BCL2 dynamics) indicates that the balance between pro-survival (BCL2) and pro-apoptotic (BAX) signals is shifting toward cell death.</w:t>
-      </w:r>
-    </w:p>
-    <w:p>
-      <w:pPr>
-        <w:pStyle w:val="Heading3"/>
-      </w:pPr>
-      <w:r>
-        <w:t>High Dose Range (BMD 6.0–10.0): Inflammatory Amplification and Multi-Organ Damage Signatures</w:t>
+        <w:t>Moderate-High Dose Range (BMD 6.0–10.0): Inflammatory Cascade, Cytokine Signaling, and Tissue Damage</w:t>
       </w:r>
     </w:p>
     <w:p>
@@ -852,7 +976,7 @@
           <w:i w:val="0"/>
           <w:sz w:val="22"/>
         </w:rPr>
-        <w:t>At BMD 6.0–10.0, the inflammatory response reaches full amplitude. **NF-κB signaling** (path:hsa04064, median BMD 9.5), **TNF signaling** (path:hsa04668, median BMD 10.0), **IL-17 signaling** (path:hsa04657, median BMD 10.0), and **JAK-STAT signaling** (path:hsa04630, median BMD 7.0) are all upregulated, with key effectors **IL6**, **IL1B**, **TNF**, and **NLRP3** driving a robust pro-inflammatory state.</w:t>
+        <w:t>At this dose range, the inflammatory response becomes dominant. The "Lipid and atherosclerosis" pathway (path:hsa05417/rno05417, median BMD 8.25, 12 genes) and multiple infection/inflammation-related pathways (Hepatitis B, C; Epstein-Barr virus; HTLV-I; Kaposi sarcoma; path:hsa05161/05163/05167/05169) are enriched—not because of actual infection, but because these pathways share core inflammatory signaling modules (NF-κB, JAK-STAT, TNF, IL-6).</w:t>
       </w:r>
     </w:p>
     <w:p>
@@ -866,35 +990,7 @@
           <w:i w:val="0"/>
           <w:sz w:val="22"/>
         </w:rPr>
-        <w:t>The **NLRP3 inflammasome** pathway (CLEC7A/inflammasome pathway, median BMD 12.0; Inflammasomes, median BMD 12.0) is activated at the upper end of this range, indicating pyroptotic signaling and IL-1β/IL-18 maturation. The **AGE-RAGE signaling pathway in diabetic complications** (path:hsa04933, median BMD 8.75) integrates oxidative stress, inflammation, and fibrotic signaling (TGFB1), suggesting advanced glycation end-product-like damage patterns.</w:t>
-      </w:r>
-    </w:p>
-    <w:p>
-      <w:pPr>
-        <w:spacing w:after="120"/>
-      </w:pPr>
-      <w:r>
-        <w:rPr>
-          <w:rFonts w:ascii="Calibri" w:hAnsi="Calibri"/>
-          <w:b/>
-          <w:sz w:val="22"/>
-        </w:rPr>
-        <w:t xml:space="preserve">Lipid and atherosclerosis: </w:t>
-      </w:r>
-      <w:r>
-        <w:rPr>
-          <w:rFonts w:ascii="Calibri" w:hAnsi="Calibri"/>
-          <w:sz w:val="22"/>
-        </w:rPr>
-        <w:t>(path:hsa05417, median BMD 8.25) now shows full engagement of 12 genes, and multiple infection/immune pathways (Hepatitis B, C; Epstein-Barr virus; HTLV-I) are enriched—not because of actual infection, but because these pathways share core inflammatory and apoptotic signaling nodes (NFKB1, STAT3, TNF, IL6, BAX, CASP3, TP53) that are activated by the toxic insult.</w:t>
-      </w:r>
-    </w:p>
-    <w:p>
-      <w:pPr>
-        <w:pStyle w:val="Heading3"/>
-      </w:pPr>
-      <w:r>
-        <w:t>Very High Dose Range (BMD 10.0–20.0): Immune Activation and Tissue Remodeling</w:t>
+        <w:t>The upregulation of TNF, IL1B, IL6, and NLRP3 at BMDs of 8–12 indicates full activation of the NLRP3 inflammasome and pro-inflammatory cytokine production. The JAK-STAT signaling pathway (path:hsa04630/rno04630, median BMD 7.0) and NF-κB signaling pathway (path:hsa04064/rno04064, median BMD 9.5) are engaged, amplifying the inflammatory signal. The "AGE-RAGE signaling pathway in diabetic complications" (path:hsa04933/rno04933, median BMD 8.75) reflects activation of advanced glycation end-product signaling, a hallmark of sustained oxidative and metabolic stress.</w:t>
       </w:r>
     </w:p>
     <w:p>
@@ -908,27 +1004,43 @@
           <w:i w:val="0"/>
           <w:sz w:val="22"/>
         </w:rPr>
-        <w:t>At the highest doses, pathways related to **adaptive immune activation** emerge: **Th1/Th2 cell differentiation** (path:hsa04658), **T cell receptor signaling** (path:hsa04660, median BMD 9.5), **natural killer cell-mediated cytotoxicity** (path:hsa04650, median BMD 9.0), and **hematopoietic cell lineage** (path:hsa04640, median BMD 11.0). This suggests recruitment and activation of immune cells in response to tissue damage (damage-associated molecular patterns, DAMPs).</w:t>
+        <w:t>The apoptosis pathway (path:hsa04210/rno04210, median BMD 7.0, 6 genes) and necroptosis pathway (path:hsa04217/rno04217, median BMD 8.5, 7 genes) are both active, indicating that multiple forms of cell death are occurring simultaneously. The "Activation of BH3-only proteins" (median BMD 5.75) and the upregulation of both BAX and BCL2 suggest that the apoptotic threshold has been crossed in a subset of cells.</w:t>
       </w:r>
     </w:p>
     <w:p>
       <w:pPr>
+        <w:pStyle w:val="Heading3"/>
+      </w:pPr>
+      <w:r>
+        <w:t>High Dose Range (BMD 10.0–20.0): Immune Activation, Fibrosis, and Systemic Toxicity</w:t>
+      </w:r>
+    </w:p>
+    <w:p>
+      <w:pPr>
         <w:spacing w:after="120"/>
       </w:pPr>
       <w:r>
         <w:rPr>
           <w:rFonts w:ascii="Calibri" w:hAnsi="Calibri"/>
-          <w:b/>
+          <w:b w:val="0"/>
+          <w:i w:val="0"/>
           <w:sz w:val="22"/>
         </w:rPr>
-        <w:t xml:space="preserve">TGF-beta signaling: </w:t>
+        <w:t>At the highest doses, immune signaling pathways dominate: Toll-like receptor signaling (path:hsa04620, median BMD 10.5), NOD-like receptor signaling (path:hsa04621, median BMD 10.5), RIG-I-like receptor signaling (path:hsa04622, median BMD 9.5), and cytokine-cytokine receptor interaction (path:hsa04060, median BMD 11.0) are all enriched. The inflammasome pathway (median BMD 12.0) and CLEC7A/inflammasome pathway (median BMD 12.0) are activated at the highest BMDs, indicating pyroptotic cell death and danger-associated molecular pattern (DAMP) release.</w:t>
       </w:r>
+    </w:p>
+    <w:p>
+      <w:pPr>
+        <w:spacing w:after="120"/>
+      </w:pPr>
       <w:r>
         <w:rPr>
           <w:rFonts w:ascii="Calibri" w:hAnsi="Calibri"/>
+          <w:b w:val="0"/>
+          <w:i w:val="0"/>
           <w:sz w:val="22"/>
         </w:rPr>
-        <w:t>(path:hsa04350, median BMD 12.5) and the **Senescence-Associated Secretory Phenotype (SASP)** (median BMD 10.25) indicate that surviving cells are entering a senescent state characterized by secretion of pro-inflammatory and pro-fibrotic mediators, consistent with tissue remodeling and potential fibrogenesis. The **dilated cardiomyopathy** (path:hsa05414, median BMD 12.5) and **hypertrophic cardiomyopathy** (path:hsa05410, median BMD 12.0) pathway enrichment at these doses suggests cardiac tissue remodeling as a late consequence.</w:t>
+        <w:t>The "Senescence-Associated Secretory Phenotype (SASP)" pathway (median BMD 10.25) is activated, consistent with cellular senescence induced by persistent DNA damage and oxidative stress. TGFB1 upregulation across multiple dose levels, combined with the enrichment of TGF-beta signaling (path:hsa04350, median BMD 12.5), indicates pro-fibrotic signaling that could lead to tissue remodeling and fibrosis with chronic exposure.</w:t>
       </w:r>
     </w:p>
     <w:p>
@@ -958,7 +1070,7 @@
         <w:pStyle w:val="Heading3"/>
       </w:pPr>
       <w:r>
-        <w:t>Primary Target Organs</w:t>
+        <w:t>2.1 Liver (Highest Confidence)</w:t>
       </w:r>
     </w:p>
     <w:p>
@@ -972,7 +1084,211 @@
           <w:i w:val="0"/>
           <w:sz w:val="22"/>
         </w:rPr>
-        <w:t>#### Liver (Highest Confidence)</w:t>
+        <w:t>The liver is predicted to be the primary target organ based on multiple converging lines of evidence:</w:t>
+      </w:r>
+    </w:p>
+    <w:p>
+      <w:pPr>
+        <w:pStyle w:val="ListBullet"/>
+        <w:spacing w:after="40"/>
+      </w:pPr>
+      <w:r>
+        <w:rPr>
+          <w:rFonts w:ascii="Calibri" w:hAnsi="Calibri"/>
+          <w:sz w:val="22"/>
+        </w:rPr>
+        <w:t>**Gene signature**: All 32 responsive genes have documented liver expression and relevance. The liver shows the broadest gene coverage in the organ signature analysis (32+ genes enriched). AHR, CYP1A1, CYP1B1, CYP3A4, NFE2L2, KEAP1, NQO1, HMOX1, GCLC, GPX1, and the full complement of inflammatory and apoptotic markers are liver-expressed.</w:t>
+      </w:r>
+    </w:p>
+    <w:p>
+      <w:pPr>
+        <w:pStyle w:val="ListBullet"/>
+        <w:spacing w:after="40"/>
+      </w:pPr>
+      <w:r>
+        <w:rPr>
+          <w:rFonts w:ascii="Calibri" w:hAnsi="Calibri"/>
+          <w:sz w:val="22"/>
+        </w:rPr>
+        <w:t>**Pathway evidence**: The KEAP1-NRF2 pathway is the master regulator of hepatic detoxification. The literature explicitly identifies "a novel mechanism of hepatotoxicity involving endoplasmic reticulum stress and Nrf2 activation" (Toxicogenomic module associations with pathogenesis, 2017). NLRP3 inflammasome activation is described as playing "a critical role in liver injury and disease progression" (NLRP3 Inflammasome Activation in Liver Disorders, 2025).</w:t>
+      </w:r>
+    </w:p>
+    <w:p>
+      <w:pPr>
+        <w:pStyle w:val="ListBullet"/>
+        <w:spacing w:after="40"/>
+      </w:pPr>
+      <w:r>
+        <w:rPr>
+          <w:rFonts w:ascii="Calibri" w:hAnsi="Calibri"/>
+          <w:sz w:val="22"/>
+        </w:rPr>
+        <w:t>**Metabolic activation**: CYP1A1 and CYP1B1 are hepatic phase I enzymes that can bioactivate xenobiotics to reactive intermediates, generating the oxidative stress that drives the downstream cascade.</w:t>
+      </w:r>
+    </w:p>
+    <w:p>
+      <w:pPr>
+        <w:pStyle w:val="ListBullet"/>
+        <w:spacing w:after="40"/>
+      </w:pPr>
+      <w:r>
+        <w:rPr>
+          <w:rFonts w:ascii="Calibri" w:hAnsi="Calibri"/>
+          <w:sz w:val="22"/>
+        </w:rPr>
+        <w:t>**Literature support**: NQO1 is identified as a prioritized gene for liver toxicity prediction (Literature optimized integration of gene expression for organ toxicity, 2019). The SIRT1/FXR pathway, engaged in this dataset, plays "a key role in regulating BSEP and MRP2 expression" in hepatobiliary transport (Dysregulation of BSEP and MRP2, 2018).</w:t>
+      </w:r>
+    </w:p>
+    <w:p>
+      <w:pPr>
+        <w:pStyle w:val="Heading3"/>
+      </w:pPr>
+      <w:r>
+        <w:t>2.2 Kidney (High Confidence)</w:t>
+      </w:r>
+    </w:p>
+    <w:p>
+      <w:pPr>
+        <w:pStyle w:val="ListBullet"/>
+        <w:spacing w:after="40"/>
+      </w:pPr>
+      <w:r>
+        <w:rPr>
+          <w:rFonts w:ascii="Calibri" w:hAnsi="Calibri"/>
+          <w:sz w:val="22"/>
+        </w:rPr>
+        <w:t>**Gene signature**: The kidney organ signature includes 31+ responsive genes (AHR, BAX, BCL2, CASP3, CAT, CDKN1A, CYP1A1, CYP1B1, and the full NRF2/inflammatory panel). Renal tubular epithelium shows specific enrichment for HMOX1, and HAVCR1 (KIM-1, a clinical biomarker of acute kidney injury) is among the responsive genes.</w:t>
+      </w:r>
+    </w:p>
+    <w:p>
+      <w:pPr>
+        <w:pStyle w:val="ListBullet"/>
+        <w:spacing w:after="40"/>
+      </w:pPr>
+      <w:r>
+        <w:rPr>
+          <w:rFonts w:ascii="Calibri" w:hAnsi="Calibri"/>
+          <w:sz w:val="22"/>
+        </w:rPr>
+        <w:t>**Pathway evidence**: The AGE-RAGE signaling pathway in diabetic complications (path:hsa04933, 10 genes) is highly relevant to renal pathology. The literature notes that "Rutin (RUT) protects against liver and kidney damage caused by valproic acid (VLP) in rats" (Rutin Protects from Destruction, 2021), directly linking the gene signature to nephrotoxicity.</w:t>
+      </w:r>
+    </w:p>
+    <w:p>
+      <w:pPr>
+        <w:pStyle w:val="ListBullet"/>
+        <w:spacing w:after="40"/>
+      </w:pPr>
+      <w:r>
+        <w:rPr>
+          <w:rFonts w:ascii="Calibri" w:hAnsi="Calibri"/>
+          <w:sz w:val="22"/>
+        </w:rPr>
+        <w:t>**Mechanistic basis**: Oxidative stress, NF-κB-mediated inflammation, and apoptosis are established mechanisms of drug-induced nephrotoxicity, all of which are represented in this dataset.</w:t>
+      </w:r>
+    </w:p>
+    <w:p>
+      <w:pPr>
+        <w:pStyle w:val="Heading3"/>
+      </w:pPr>
+      <w:r>
+        <w:t>2.3 Testis and Male Reproductive System (High Confidence)</w:t>
+      </w:r>
+    </w:p>
+    <w:p>
+      <w:pPr>
+        <w:pStyle w:val="ListBullet"/>
+        <w:spacing w:after="40"/>
+      </w:pPr>
+      <w:r>
+        <w:rPr>
+          <w:rFonts w:ascii="Calibri" w:hAnsi="Calibri"/>
+          <w:sz w:val="22"/>
+        </w:rPr>
+        <w:t>**Gene signature**: The testis/testes show remarkably broad gene coverage (19–20+ genes), including AHR, BAX, BCL2, CASP3, CAT, CYP1A1, CYP1B1, GCLC, GPX1, HMOX1, IL1B, IL6, KEAP1, NFE2L2, NFKB1, NQO1, SIRT1, SOD1, SOD2, STAT3, TNF, TP53. The cauda epididymis (GCLC, HMOX1, NFE2L2, NQO1) and spermatocytes (SIRT1, TP53) show specific enrichment.</w:t>
+      </w:r>
+    </w:p>
+    <w:p>
+      <w:pPr>
+        <w:pStyle w:val="ListBullet"/>
+        <w:spacing w:after="40"/>
+      </w:pPr>
+      <w:r>
+        <w:rPr>
+          <w:rFonts w:ascii="Calibri" w:hAnsi="Calibri"/>
+          <w:sz w:val="22"/>
+        </w:rPr>
+        <w:t>**Literature support**: "The RuIII/Q complex has potent antioxidant and anti-inflammatory effects, reducing oxidative stress and apoptosis in testicular and brain tissues" (Potential Therapeutic Effects of New Ruthenium (III) Complex, 2021). The apoptotic signature (BAX, BCL2, CASP3, TP53) in testicular tissue is consistent with germ cell death.</w:t>
+      </w:r>
+    </w:p>
+    <w:p>
+      <w:pPr>
+        <w:pStyle w:val="ListBullet"/>
+        <w:spacing w:after="40"/>
+      </w:pPr>
+      <w:r>
+        <w:rPr>
+          <w:rFonts w:ascii="Calibri" w:hAnsi="Calibri"/>
+          <w:sz w:val="22"/>
+        </w:rPr>
+        <w:t>**Functional concern**: The combination of oxidative stress, apoptosis, and inflammatory cytokine production in the testis raises concern for impaired spermatogenesis and male reproductive toxicity.</w:t>
+      </w:r>
+    </w:p>
+    <w:p>
+      <w:pPr>
+        <w:pStyle w:val="Heading3"/>
+      </w:pPr>
+      <w:r>
+        <w:t>2.4 Brain and Central Nervous System (High Confidence)</w:t>
+      </w:r>
+    </w:p>
+    <w:p>
+      <w:pPr>
+        <w:pStyle w:val="ListBullet"/>
+        <w:spacing w:after="40"/>
+      </w:pPr>
+      <w:r>
+        <w:rPr>
+          <w:rFonts w:ascii="Calibri" w:hAnsi="Calibri"/>
+          <w:sz w:val="22"/>
+        </w:rPr>
+        <w:t>**Gene signature**: Brain tissue shows coverage of 27+ genes. Specific neural substructures are enriched: substantia nigra (9 genes including BAX, HMOX1, IL1B, IL6, NFE2L2, SOD1, SOD2, TNF, TP53), microglia (10+ genes), hippocampus, spinal cord, and dorsal root ganglia.</w:t>
+      </w:r>
+    </w:p>
+    <w:p>
+      <w:pPr>
+        <w:pStyle w:val="ListBullet"/>
+        <w:spacing w:after="40"/>
+      </w:pPr>
+      <w:r>
+        <w:rPr>
+          <w:rFonts w:ascii="Calibri" w:hAnsi="Calibri"/>
+          <w:sz w:val="22"/>
+        </w:rPr>
+        <w:t>**Pathway evidence**: The "negative regulation of neuron apoptotic process" (GO:0043524, 11 genes) and "neuron apoptotic process" (GO:0051402, 7 genes) GO terms indicate active neuronal death signaling. The blood-brain barrier shows specific enrichment</w:t>
+      </w:r>
+    </w:p>
+    <w:p>
+      <w:pPr>
+        <w:pStyle w:val="Heading1"/>
+      </w:pPr>
+      <w:r>
+        <w:t>Run 3 (80.2s)</w:t>
+      </w:r>
+    </w:p>
+    <w:p>
+      <w:pPr>
+        <w:pStyle w:val="Heading2"/>
+      </w:pPr>
+      <w:r>
+        <w:t>Comprehensive Toxicogenomic Interpretation Report</w:t>
+      </w:r>
+    </w:p>
+    <w:p>
+      <w:pPr>
+        <w:pStyle w:val="Heading2"/>
+      </w:pPr>
+      <w:r>
+        <w:t>Executive Summary</w:t>
       </w:r>
     </w:p>
     <w:p>
@@ -986,294 +1302,7 @@
           <w:i w:val="0"/>
           <w:sz w:val="22"/>
         </w:rPr>
-        <w:t>The liver emerges as the most probable primary target organ based on multiple converging lines of evidence:</w:t>
-      </w:r>
-    </w:p>
-    <w:p>
-      <w:pPr>
-        <w:pStyle w:val="ListBullet"/>
-        <w:spacing w:after="40"/>
-      </w:pPr>
-      <w:r>
-        <w:rPr>
-          <w:rFonts w:ascii="Calibri" w:hAnsi="Calibri"/>
-          <w:sz w:val="22"/>
-        </w:rPr>
-        <w:t>**Gene signature**: 31+ genes from the responsive set show liver-associated expression (enrichment 45.06×), including the complete AHR-CYP1A1/CYP1B1 xenobiotic metabolism axis, the KEAP1-NFE2L2-NQO1-HMOX1-GCLC antioxidant battery, inflammatory mediators (IL6, IL1B, TNF, NFKB1), apoptotic regulators (BAX, BCL2, CASP3, TP53), and metabolic sensors (PPARA, SIRT1).</w:t>
-      </w:r>
-    </w:p>
-    <w:p>
-      <w:pPr>
-        <w:pStyle w:val="ListBullet"/>
-        <w:spacing w:after="40"/>
-      </w:pPr>
-      <w:r>
-        <w:rPr>
-          <w:rFonts w:ascii="Calibri" w:hAnsi="Calibri"/>
-          <w:sz w:val="22"/>
-        </w:rPr>
-        <w:t>**Pathway concordance**: The early activation of AHR signaling and Phase I/II metabolism is characteristic of hepatic first-pass metabolism. The progression to NF-κB-mediated inflammation, TP53-dependent apoptosis, and TGFB1-driven fibrotic signaling recapitulates the well-established adverse outcome pathway for drug-induced liver injury (DILI).</w:t>
-      </w:r>
-    </w:p>
-    <w:p>
-      <w:pPr>
-        <w:pStyle w:val="ListBullet"/>
-        <w:spacing w:after="40"/>
-      </w:pPr>
-      <w:r>
-        <w:rPr>
-          <w:rFonts w:ascii="Calibri" w:hAnsi="Calibri"/>
-          <w:sz w:val="22"/>
-        </w:rPr>
-        <w:t>**Literature support**: Quantitative transcriptional biomarkers for xenobiotic receptor activation in rat liver, including AHR and NFE2L2 targets, have been validated as predictors of DILI (Quantitative Transcriptional Biomarkers of Xenobiotic Receptor Activation, 2020). Cadmium-induced toxicity in hepatic macrophages (Kupffer cells) activates NF-κB and NRF2, alters macrophage polarization, and promotes hepatic inflammation and fibrosis (Research Advances on Cadmium-Induced Toxicity in Hepatic Macrophages, 2026). The enrichment of **Hepatic Kupffer Cells** (671.56× for HMOX1) further supports hepatic involvement.</w:t>
-      </w:r>
-    </w:p>
-    <w:p>
-      <w:pPr>
-        <w:pStyle w:val="ListBullet"/>
-        <w:spacing w:after="40"/>
-      </w:pPr>
-      <w:r>
-        <w:rPr>
-          <w:rFonts w:ascii="Calibri" w:hAnsi="Calibri"/>
-          <w:sz w:val="22"/>
-        </w:rPr>
-        <w:t>**Mechanistic coherence**: The dose-ordered activation of AHR → NRF2 → TP53 → NF-κB/inflammation → TGFB1/fibrosis mirrors the canonical hepatotoxicity progression from metabolic activation through oxidative stress to inflammation and fibrosis.</w:t>
-      </w:r>
-    </w:p>
-    <w:p>
-      <w:pPr>
-        <w:spacing w:after="120"/>
-      </w:pPr>
-      <w:r>
-        <w:rPr>
-          <w:rFonts w:ascii="Calibri" w:hAnsi="Calibri"/>
-          <w:b w:val="0"/>
-          <w:i w:val="0"/>
-          <w:sz w:val="22"/>
-        </w:rPr>
-        <w:t>#### Kidney (High Confidence)</w:t>
-      </w:r>
-    </w:p>
-    <w:p>
-      <w:pPr>
-        <w:spacing w:after="120"/>
-      </w:pPr>
-      <w:r>
-        <w:rPr>
-          <w:rFonts w:ascii="Calibri" w:hAnsi="Calibri"/>
-          <w:b w:val="0"/>
-          <w:i w:val="0"/>
-          <w:sz w:val="22"/>
-        </w:rPr>
-        <w:t>The kidney is the second most likely target organ:</w:t>
-      </w:r>
-    </w:p>
-    <w:p>
-      <w:pPr>
-        <w:pStyle w:val="ListBullet"/>
-        <w:spacing w:after="40"/>
-      </w:pPr>
-      <w:r>
-        <w:rPr>
-          <w:rFonts w:ascii="Calibri" w:hAnsi="Calibri"/>
-          <w:sz w:val="22"/>
-        </w:rPr>
-        <w:t>**Gene signature**: 26+ genes show kidney-associated expression (enrichment 75.59×), including the complete oxidative stress defense panel (NFE2L2, HMOX1, NQO1, GCLC, GPX1, SOD1, SOD2, CAT), apoptotic markers (BAX, BCL2, CASP3, TP53), and inflammatory mediators.</w:t>
-      </w:r>
-    </w:p>
-    <w:p>
-      <w:pPr>
-        <w:pStyle w:val="ListBullet"/>
-        <w:spacing w:after="40"/>
-      </w:pPr>
-      <w:r>
-        <w:rPr>
-          <w:rFonts w:ascii="Calibri" w:hAnsi="Calibri"/>
-          <w:sz w:val="22"/>
-        </w:rPr>
-        <w:t>**Organ-specific markers**: **Renal Tubular Epithelium** shows 671.56× enrichment for HMOX1, and **HAVCR1** (KIM-1, a validated renal injury biomarker) is among the responsive genes in the xenobiotic stimulus GO term.</w:t>
-      </w:r>
-    </w:p>
-    <w:p>
-      <w:pPr>
-        <w:pStyle w:val="ListBullet"/>
-        <w:spacing w:after="40"/>
-      </w:pPr>
-      <w:r>
-        <w:rPr>
-          <w:rFonts w:ascii="Calibri" w:hAnsi="Calibri"/>
-          <w:sz w:val="22"/>
-        </w:rPr>
-        <w:t>**Literature support**: Nanocurcumin mitigates doxorubicin-induced nephrotoxicity by modulating VEGF and AhR pathways (Aryl Hydrocarbon Receptor and Vascular Endothelial Growth Factor, 2026). Fenofibrate differentially activates PPARα-mediated lipid metabolism in kidney with organ-specific toxicity (Fenofibrate differentially activates PPARα, 2025).</w:t>
-      </w:r>
-    </w:p>
-    <w:p>
-      <w:pPr>
-        <w:pStyle w:val="ListBullet"/>
-        <w:spacing w:after="40"/>
-      </w:pPr>
-      <w:r>
-        <w:rPr>
-          <w:rFonts w:ascii="Calibri" w:hAnsi="Calibri"/>
-          <w:sz w:val="22"/>
-        </w:rPr>
-        <w:t>**Pathway concordance**: AGE-RAGE signaling in diabetic complications (path:hsa04933) is strongly associated with diabetic nephropathy, and its enrichment (10 genes, median BMD 8.75) suggests renal tubular damage at moderate-to-high doses.</w:t>
-      </w:r>
-    </w:p>
-    <w:p>
-      <w:pPr>
-        <w:spacing w:after="120"/>
-      </w:pPr>
-      <w:r>
-        <w:rPr>
-          <w:rFonts w:ascii="Calibri" w:hAnsi="Calibri"/>
-          <w:b w:val="0"/>
-          <w:i w:val="0"/>
-          <w:sz w:val="22"/>
-        </w:rPr>
-        <w:t>#### Heart (Moderate-High Confidence)</w:t>
-      </w:r>
-    </w:p>
-    <w:p>
-      <w:pPr>
-        <w:spacing w:after="120"/>
-      </w:pPr>
-      <w:r>
-        <w:rPr>
-          <w:rFonts w:ascii="Calibri" w:hAnsi="Calibri"/>
-          <w:b w:val="0"/>
-          <w:i w:val="0"/>
-          <w:sz w:val="22"/>
-        </w:rPr>
-        <w:t>Cardiac tissue shows substantial gene signature overlap:</w:t>
-      </w:r>
-    </w:p>
-    <w:p>
-      <w:pPr>
-        <w:pStyle w:val="ListBullet"/>
-        <w:spacing w:after="40"/>
-      </w:pPr>
-      <w:r>
-        <w:rPr>
-          <w:rFonts w:ascii="Calibri" w:hAnsi="Calibri"/>
-          <w:sz w:val="22"/>
-        </w:rPr>
-        <w:t>**Gene signature**: 26+ genes with cardiac expression (enrichment 51.35×), including the complete stress response panel plus cardiac-specific pathway enrichment for dilated cardiomyopathy (path:hsa05414, median BMD 12.5) and hypertrophic cardiomyopathy (path:hsa05410, median BMD 12.0).</w:t>
-      </w:r>
-    </w:p>
-    <w:p>
-      <w:pPr>
-        <w:pStyle w:val="ListBullet"/>
-        <w:spacing w:after="40"/>
-      </w:pPr>
-      <w:r>
-        <w:rPr>
-          <w:rFonts w:ascii="Calibri" w:hAnsi="Calibri"/>
-          <w:sz w:val="22"/>
-        </w:rPr>
-        <w:t>**Organ-specific markers**: **Pericardium** (335.78× enrichment for IL1B, IL6), **Right Ventricle** (83.95× for IL1B, TNF), **Left Ventricular Myocardium** (111.93× for VEGFA), and **Cardiac Microvasculature** (223.85× for TGFB1) all show significant enrichment.</w:t>
-      </w:r>
-    </w:p>
-    <w:p>
-      <w:pPr>
-        <w:pStyle w:val="ListBullet"/>
-        <w:spacing w:after="40"/>
-      </w:pPr>
-      <w:r>
-        <w:rPr>
-          <w:rFonts w:ascii="Calibri" w:hAnsi="Calibri"/>
-          <w:sz w:val="22"/>
-        </w:rPr>
-        <w:t>**Literature support**: Whey protein pre-treatment alleviates thioacetamide-induced cardiotoxicity by reducing oxidative stress, inflammatory response, and apoptotic markers including CASP3, BAX, BCL2, TNF, and IL1B (The cardioprotective effect of whey protein, 2025). Cardiomyocyte gene programs in cardiac hypertrophy and failure involve NFE2L2 and TP53 (Cardiomyocyte gene programs, 2018).</w:t>
-      </w:r>
-    </w:p>
-    <w:p>
-      <w:pPr>
-        <w:pStyle w:val="ListBullet"/>
-        <w:spacing w:after="40"/>
-      </w:pPr>
-      <w:r>
-        <w:rPr>
-          <w:rFonts w:ascii="Calibri" w:hAnsi="Calibri"/>
-          <w:sz w:val="22"/>
-        </w:rPr>
-        <w:t>**Mechanistic basis**: The late activation of cardiomyopathy pathways (BMD 12.0–12.5) suggests cardiac effects are secondary to systemic inflammation and oxidative stress rather than direct cardiotoxicity.</w:t>
-      </w:r>
-    </w:p>
-    <w:p>
-      <w:pPr>
-        <w:spacing w:after="120"/>
-      </w:pPr>
-      <w:r>
-        <w:rPr>
-          <w:rFonts w:ascii="Calibri" w:hAnsi="Calibri"/>
-          <w:b w:val="0"/>
-          <w:i w:val="0"/>
-          <w:sz w:val="22"/>
-        </w:rPr>
-        <w:t>#### Brain/Central Nervous System (Moderate Confidence)</w:t>
-      </w:r>
-    </w:p>
-    <w:p>
-      <w:pPr>
-        <w:spacing w:after="120"/>
-      </w:pPr>
-      <w:r>
-        <w:rPr>
-          <w:rFonts w:ascii="Calibri" w:hAnsi="Calibri"/>
-          <w:b w:val="0"/>
-          <w:i w:val="0"/>
-          <w:sz w:val="22"/>
-        </w:rPr>
-        <w:t>Neurotoxicity is supported by:</w:t>
-      </w:r>
-    </w:p>
-    <w:p>
-      <w:pPr>
-        <w:pStyle w:val="ListBullet"/>
-        <w:spacing w:after="40"/>
-      </w:pPr>
-      <w:r>
-        <w:rPr>
-          <w:rFonts w:ascii="Calibri" w:hAnsi="Calibri"/>
-          <w:sz w:val="22"/>
-        </w:rPr>
-        <w:t>**Gene signature**: 21+ genes with brain expression (enrichment 67.48×), including neuronal survival genes (BAX, BCL2, SIRT1, SOD1, SOD2), inflammatory mediators (IL1B, IL6, TNF), and the NRF2 axis.</w:t>
-      </w:r>
-    </w:p>
-    <w:p>
-      <w:pPr>
-        <w:pStyle w:val="ListBullet"/>
-        <w:spacing w:after="40"/>
-      </w:pPr>
-      <w:r>
-        <w:rPr>
-          <w:rFonts w:ascii="Calibri" w:hAnsi="Calibri"/>
-          <w:sz w:val="22"/>
-        </w:rPr>
-        <w:t>**Organ-specific markers**: **Cingulate Cortex** (671.56× for NFE2L2), **Neurons** (184.68× for 13+ genes), **Substantia Nigra** (268.62× for BAX, TP53), **Hippocampal CA1 Region** (191.88× for BAX, BCL2), and **Neurodegenerative Tissues** (503.67× for BAX, BCL2, NFE2L2).</w:t>
-      </w:r>
-    </w:p>
-    <w:p>
-      <w:pPr>
-        <w:pStyle w:val="ListBullet"/>
-        <w:spacing w:after="40"/>
-      </w:pPr>
-      <w:r>
-        <w:rPr>
-          <w:rFonts w:ascii="Calibri" w:hAnsi="Calibri"/>
-          <w:sz w:val="22"/>
-        </w:rPr>
-        <w:t>**Literature support**: Cadmium-induced neurotoxicity in SH-SY5Y cells involves p53 signaling, heat shock proteins, and disruption of essential metal homeostasis (Neuronal specific and non-specific responses to cadmium, 2019). Selective cytotoxicity of amyloid β through p53 and BAX</w:t>
-      </w:r>
-    </w:p>
-    <w:p>
-      <w:pPr>
-        <w:pStyle w:val="Heading1"/>
-      </w:pPr>
-      <w:r>
-        <w:t>Run 3 (77.1s)</w:t>
+        <w:t>This dose-response analysis reveals a coherent toxicological signature characterized by early activation of xenobiotic metabolism and antioxidant defense pathways (BMD 0.2–0.55), followed by progressive engagement of oxidative stress responses, inflammatory signaling, apoptotic cascades, and ultimately broad tissue damage pathways at higher doses (BMD 5–20). The 32 responsive genes (27 upregulated, 5 downregulated) define a classical oxidative stress–inflammation–cell death continuum. The gene expression profile is dominated by the KEAP1-NRF2-ARE axis, NF-κB-mediated inflammation, NLRP3 inflammasome activation, and TP53-dependent apoptosis, with the strongest organ-level signatures pointing to liver, kidney, brain, testis, and cardiovascular tissues as primary targets.</w:t>
       </w:r>
     </w:p>
     <w:p>
@@ -1300,6 +1329,14 @@
     </w:p>
     <w:p>
       <w:pPr>
+        <w:pStyle w:val="Heading3"/>
+      </w:pPr>
+      <w:r>
+        <w:t>Phase I: Xenobiotic Sensing and Metabolic Activation (BMD 0.2–0.55)</w:t>
+      </w:r>
+    </w:p>
+    <w:p>
+      <w:pPr>
         <w:spacing w:after="120"/>
       </w:pPr>
       <w:r>
@@ -1309,15 +1346,7 @@
           <w:i w:val="0"/>
           <w:sz w:val="22"/>
         </w:rPr>
-        <w:t>The 32 responsive genes (27 upregulated, 5 downregulated) across a BMD range of 0.2–20 reveal a coherent, dose-dependent progression from early adaptive cytoprotection to overt cellular damage, inflammation, and programmed cell death.</w:t>
-      </w:r>
-    </w:p>
-    <w:p>
-      <w:pPr>
-        <w:pStyle w:val="Heading3"/>
-      </w:pPr>
-      <w:r>
-        <w:t>Ultra-Low Dose Range (BMD 0.2–0.5): Xenobiotic Sensing and Phase I/II Metabolism</w:t>
+        <w:t>The earliest transcriptional responses occur at the lowest benchmark doses and are dominated by **aryl hydrocarbon receptor (AHR) signaling** (median BMD 0.35), representing the molecular initiating event. Three genes respond at BMD 0.2–0.35, predominantly upregulated, indicating immediate xenobiotic sensing. AHR activation drives the induction of phase I metabolizing enzymes **CYP1A1** and **CYP1B1**, consistent with the enrichment of the chemical carcinogenesis pathway (path:hsa05208/rno05208, median BMD 0.5, 9 genes). This pathway includes AHR, CYP1A1, HIF1A, HMOX1, KEAP1, NFE2L2, NFKB1, NQO1, and VEGFA — indicating that even at these low doses, the compound engages both xenobiotic metabolism and the initial stages of the oxidative stress response.</w:t>
       </w:r>
     </w:p>
     <w:p>
@@ -1331,7 +1360,7 @@
           <w:i w:val="0"/>
           <w:sz w:val="22"/>
         </w:rPr>
-        <w:t>The earliest molecular events center on aryl hydrocarbon receptor (AHR) signaling, with AHR pathway activation detected at a median BMD of 0.35 (3 genes, predominantly upregulated). This is immediately followed by engagement of the chemical carcinogenesis–reactive oxygen species pathway (path:hsa05208/rno05208; median BMD 0.5; 9 genes including AHR, CYP1A1, HIF1A, HMOX1, KEAP1, NFE2L2, NFKB1, NQO1, VEGFA). Concurrently, metabolic pathway genes (path:rno01100/hsa01100; median BMD 0.5) are activated, reflecting engagement of Phase I biotransformation enzymes (CYP1A1, CYP1B1) and early Nrf2-dependent Phase II detoxification.</w:t>
+        <w:t>Concurrently, the **KEAP1-NRF2 axis** is activated at very low doses (BMD 0.3–0.55). The enrichment of "GSK3B and BTRC:CUL1-mediated degradation of NFE2L2" and "Nuclear events mediated by NFE2L2" pathways (median BMD 0.55) with mixed directionality suggests that KEAP1 (a negative regulator) and NFE2L2 are being modulated simultaneously — consistent with disruption of the KEAP1-NRF2 interaction and nuclear translocation of NRF2. The upregulation of downstream targets **NQO1**, **HMOX1**, and **GCLC** confirms functional NRF2 activation. Metabolic pathways (path:hsa01100/rno01100, median BMD 0.5) involving CYP1A1, CYP1B1, GCLC, and related metabolic enzymes are also engaged, reflecting altered cellular metabolism.</w:t>
       </w:r>
     </w:p>
     <w:p>
@@ -1345,7 +1374,7 @@
           <w:i w:val="0"/>
           <w:sz w:val="22"/>
         </w:rPr>
-        <w:t>At this dose tier, the response is dominated by xenobiotic recognition and metabolic activation. AHR-mediated transcriptional induction of CYP1A1 and CYP1B1 represents the canonical xenobiotic-sensing response, consistent with the compound acting as an AHR ligand or generating AHR-activating metabolites. The simultaneous appearance of NFE2L2 (Nrf2) nuclear events and KEAP1-mediated regulatory processes (median BMD 0.55) indicates that oxidative or electrophilic stress is generated as a direct consequence of Phase I metabolism, triggering the Keap1-Nrf2-ARE cytoprotective axis.</w:t>
+        <w:t>The biosynthesis of cofactors pathway (path:hsa01240, median BMD 0.55) with 2 upregulated genes further supports early metabolic reprogramming, likely reflecting increased demand for NAD(P)H and glutathione cofactors required for phase II detoxification.</w:t>
       </w:r>
     </w:p>
     <w:p>
@@ -1353,7 +1382,7 @@
         <w:pStyle w:val="Heading3"/>
       </w:pPr>
       <w:r>
-        <w:t>Low Dose Range (BMD 0.5–2.0): Oxidative Stress Defense and Early Ferroptosis Signaling</w:t>
+        <w:t>Phase II: Ferroptosis Defense and Early Stress Signaling (BMD 0.4–2.0)</w:t>
       </w:r>
     </w:p>
     <w:p>
@@ -1367,7 +1396,7 @@
           <w:i w:val="0"/>
           <w:sz w:val="22"/>
         </w:rPr>
-        <w:t>Between BMD 0.5 and 2.0, the response broadens to include biosynthesis of cofactors (path:rno01240/hsa01240; median BMD 0.55), ferroptosis-related pathways (path:hsa04216/rno04216; median BMD 0.6; genes including GPX1, GCLC), and cushing syndrome-related signaling (path:hsa04934/rno04934; median BMD 2.35). The upregulation of GCLC (glutamate-cysteine ligase catalytic subunit), GPX1 (glutathione peroxidase 1), NQO1 (NAD(P)H quinone dehydrogenase 1), CAT (catalase), SOD1, and SOD2 at these doses reflects a robust antioxidant defense mobilization. These enzymes collectively neutralize reactive oxygen species (ROS), maintain glutathione homeostasis, and protect against lipid peroxidation.</w:t>
+        <w:t>At slightly higher doses, **ferroptosis-related pathways** (path:hsa04216/rno04216, median BMD 0.6, 3 genes, mostly upregulated) become engaged. This is significant because it indicates that the compound generates sufficient oxidative stress to threaten lipid peroxidation and iron-dependent cell death. The upregulation of protective genes (likely GPX1, HMOX1, and related antioxidant enzymes) at this stage represents an adaptive response to prevent ferroptotic damage.</w:t>
       </w:r>
     </w:p>
     <w:p>
@@ -1381,7 +1410,7 @@
           <w:i w:val="0"/>
           <w:sz w:val="22"/>
         </w:rPr>
-        <w:t>Notably, the ferroptosis pathway activation at BMD 0.6 is significant: the upregulation of GPX1 and GCLC at this stage likely represents a protective response against iron-dependent lipid peroxidation rather than active ferroptotic cell death. The downregulation observed in the circadian clock pathway (median BMD 2.25; 2 genes, mostly DOWN) suggests early disruption of circadian transcriptional regulation, which may reflect metabolic stress or direct interference with clock gene networks.</w:t>
+        <w:t>The engagement of **PPARA signaling** (path:hsa04934/rno04934, median BMD 2.35) suggests perturbation of lipid metabolism and fatty acid oxidation, which may reflect either a direct effect of the compound on lipid homeostasis or a compensatory metabolic response to oxidative stress.</w:t>
       </w:r>
     </w:p>
     <w:p>
@@ -1389,7 +1418,7 @@
         <w:pStyle w:val="Heading3"/>
       </w:pPr>
       <w:r>
-        <w:t>Moderate Dose Range (BMD 2.0–5.0): Transition to Damage Signaling</w:t>
+        <w:t>Phase III: Circadian Disruption and Metabolic Dysregulation (BMD 2.0–2.5)</w:t>
       </w:r>
     </w:p>
     <w:p>
@@ -1403,27 +1432,15 @@
           <w:i w:val="0"/>
           <w:sz w:val="22"/>
         </w:rPr>
-        <w:t>This dose range marks a critical inflection point where protective responses begin to be overwhelmed and damage-associated pathways emerge.</w:t>
+        <w:t>A notable finding is the **downregulation** of circadian clock genes (median BMD 2.25, 2 genes, mostly DOWN). This is one of the few downregulated responses and may reflect disruption of circadian-regulated metabolic processes. Circadian clock disruption has been increasingly recognized as a feature of toxic exposures that perturb NAD+ metabolism and SIRT1 activity. The concurrent engagement of glucocorticoid receptor signaling (path:hsa04922/rno04922) further supports metabolic and endocrine disruption at this dose range.</w:t>
       </w:r>
     </w:p>
     <w:p>
       <w:pPr>
-        <w:spacing w:after="120"/>
+        <w:pStyle w:val="Heading3"/>
       </w:pPr>
       <w:r>
-        <w:rPr>
-          <w:rFonts w:ascii="Calibri" w:hAnsi="Calibri"/>
-          <w:b/>
-          <w:sz w:val="22"/>
-        </w:rPr>
-        <w:t xml:space="preserve">Hepatocellular carcinoma-related signaling: </w:t>
-      </w:r>
-      <w:r>
-        <w:rPr>
-          <w:rFonts w:ascii="Calibri" w:hAnsi="Calibri"/>
-          <w:sz w:val="22"/>
-        </w:rPr>
-        <w:t>(path:hsa05225/rno05225; median BMD 2.65; 8 genes) and **mitophagy** (path:rno04137/hsa04137; median BMD 3.5; 3 genes) are activated, indicating mitochondrial stress and quality control responses. The concurrent activation of **autophagy** (path:rno04140/hsa04140; median BMD 3.5; 3 genes including SQSTM1) and **Wnt signaling** (path:hsa04310/rno04310; median BMD 3.75) suggests cellular attempts to manage damaged organelles and maintain tissue homeostasis.</w:t>
+        <w:t>Phase IV: Oncogenic Stress and Proliferative Signaling (BMD 2.5–5.0)</w:t>
       </w:r>
     </w:p>
     <w:p>
@@ -1437,7 +1454,59 @@
           <w:i w:val="0"/>
           <w:sz w:val="22"/>
         </w:rPr>
-        <w:t>By BMD 4.0, the fluid shear stress and atherosclerosis pathway (path:rno05418/hsa05418; 11 genes) and chemical carcinogenesis–receptor activation pathway (path:rno05207/hsa05207; 7 genes) are fully engaged. The former pathway includes BCL2, HMOX1, IL1B, KEAP1, NFE2L2, NFKB1, NQO1, SQSTM1, TNF, TP53, and VEGFA—a signature reflecting the convergence of oxidative stress, inflammatory, and vascular injury responses.</w:t>
+        <w:t>Between BMD 2.5 and 5.0, the transcriptional response broadens dramatically to encompass cancer-related pathways. **Hepatocellular carcinoma pathways** (path:hsa05225/rno05225, median BMD 2.65, 8 genes) are among the first cancer pathways activated, followed by renal cell carcinoma (path:hsa05211, median BMD 4.25) and multiple other cancer-type pathways. This does not necessarily indicate carcinogenesis but rather reflects the engagement of shared oncogenic signaling nodes including:</w:t>
+      </w:r>
+    </w:p>
+    <w:p>
+      <w:pPr>
+        <w:pStyle w:val="ListBullet"/>
+        <w:spacing w:after="40"/>
+      </w:pPr>
+      <w:r>
+        <w:rPr>
+          <w:rFonts w:ascii="Calibri" w:hAnsi="Calibri"/>
+          <w:sz w:val="22"/>
+        </w:rPr>
+        <w:t>**TP53 activation** (upregulated) with downstream targets CDKN1A (p21) and BAX</w:t>
+      </w:r>
+    </w:p>
+    <w:p>
+      <w:pPr>
+        <w:pStyle w:val="ListBullet"/>
+        <w:spacing w:after="40"/>
+      </w:pPr>
+      <w:r>
+        <w:rPr>
+          <w:rFonts w:ascii="Calibri" w:hAnsi="Calibri"/>
+          <w:sz w:val="22"/>
+        </w:rPr>
+        <w:t>**STAT3 signaling** (upregulated), indicating JAK-STAT pathway engagement</w:t>
+      </w:r>
+    </w:p>
+    <w:p>
+      <w:pPr>
+        <w:pStyle w:val="ListBullet"/>
+        <w:spacing w:after="40"/>
+      </w:pPr>
+      <w:r>
+        <w:rPr>
+          <w:rFonts w:ascii="Calibri" w:hAnsi="Calibri"/>
+          <w:sz w:val="22"/>
+        </w:rPr>
+        <w:t>**HIF1A** upregulation, suggesting hypoxic stress or pseudohypoxic signaling</w:t>
+      </w:r>
+    </w:p>
+    <w:p>
+      <w:pPr>
+        <w:pStyle w:val="ListBullet"/>
+        <w:spacing w:after="40"/>
+      </w:pPr>
+      <w:r>
+        <w:rPr>
+          <w:rFonts w:ascii="Calibri" w:hAnsi="Calibri"/>
+          <w:sz w:val="22"/>
+        </w:rPr>
+        <w:t>**VEGFA** induction, consistent with HIF1A-driven angiogenic signaling</w:t>
       </w:r>
     </w:p>
     <w:p>
@@ -1451,15 +1520,35 @@
           <w:i w:val="0"/>
           <w:sz w:val="22"/>
         </w:rPr>
-        <w:t>The **TP53 signaling pathway** (path:rno04115/hsa04115; median BMD 5.5; 5 genes) and **cell cycle** (path:rno04110/hsa04110; median BMD 5.0; 3 genes) become active, with upregulation of TP53, CDKN1A (p21), and BAX indicating DNA damage checkpoint activation and cell cycle arrest. The concurrent upregulation of CDKN1A (a direct p53 transcriptional target) confirms functional p53 pathway engagement.</w:t>
+        <w:t>The activation of **mitophagy** (path:hsa04137/rno04137, median BMD 3.5) and **autophagy** (path:hsa04140/rno04140, median BMD 3.5) pathways, with SQSTM1/p62 upregulation, indicates that cells are engaging quality control mechanisms to remove damaged mitochondria and protein aggregates. This represents a critical transition point where cellular damage is accumulating faster than primary antioxidant defenses can manage.</w:t>
       </w:r>
     </w:p>
     <w:p>
       <w:pPr>
+        <w:spacing w:after="120"/>
+      </w:pPr>
+      <w:r>
+        <w:rPr>
+          <w:rFonts w:ascii="Calibri" w:hAnsi="Calibri"/>
+          <w:b/>
+          <w:sz w:val="22"/>
+        </w:rPr>
+        <w:t xml:space="preserve">Wnt signaling: </w:t>
+      </w:r>
+      <w:r>
+        <w:rPr>
+          <w:rFonts w:ascii="Calibri" w:hAnsi="Calibri"/>
+          <w:sz w:val="22"/>
+        </w:rPr>
+        <w:t>(path:hsa04310, median BMD 3.75, mixed directionality) perturbation suggests effects on cell fate determination and tissue homeostasis.</w:t>
+      </w:r>
+    </w:p>
+    <w:p>
+      <w:pPr>
         <w:pStyle w:val="Heading3"/>
       </w:pPr>
       <w:r>
-        <w:t>Moderate-High Dose Range (BMD 5.0–8.0): Inflammation, Apoptosis, and Tissue Injury</w:t>
+        <w:t>Phase V: Lipid Peroxidation and Fluid Shear Stress Response (BMD 4.0–5.0)</w:t>
       </w:r>
     </w:p>
     <w:p>
@@ -1473,75 +1562,7 @@
           <w:i w:val="0"/>
           <w:sz w:val="22"/>
         </w:rPr>
-        <w:t>The pathways in cancer (path:rno05200/hsa05200; median BMD 5.0; 15 genes) now reach full activation, encompassing the complete spectrum of oncogenic stress responses: apoptosis regulators (BAX, BCL2, CASP3), cell cycle control (CDKN1A, TP53), angiogenesis (VEGFA, HIF1A), inflammation (IL6, NFKB1), and cytoprotection (NFE2L2, NQO1, HMOX1).</w:t>
-      </w:r>
-    </w:p>
-    <w:p>
-      <w:pPr>
-        <w:spacing w:after="120"/>
-      </w:pPr>
-      <w:r>
-        <w:rPr>
-          <w:rFonts w:ascii="Calibri" w:hAnsi="Calibri"/>
-          <w:b/>
-          <w:sz w:val="22"/>
-        </w:rPr>
-        <w:t xml:space="preserve">Apoptotic signaling: </w:t>
-      </w:r>
-      <w:r>
-        <w:rPr>
-          <w:rFonts w:ascii="Calibri" w:hAnsi="Calibri"/>
-          <w:sz w:val="22"/>
-        </w:rPr>
-        <w:t>intensifies with activation of BH3-only proteins (median BMD 5.75), TP53-regulated cell death genes (median BMD 5.75), and the apoptosis pathway proper (path:hsa04210/rno04210; median BMD 7.0; 6 genes). The upregulation of BAX (pro-apoptotic) alongside BCL2 (anti-apoptotic) suggests a dynamic balance, but the predominant upward direction of BAX and CASP3 (caspase-3, the executioner caspase) indicates net pro-apoptotic signaling.</w:t>
-      </w:r>
-    </w:p>
-    <w:p>
-      <w:pPr>
-        <w:spacing w:after="120"/>
-      </w:pPr>
-      <w:r>
-        <w:rPr>
-          <w:rFonts w:ascii="Calibri" w:hAnsi="Calibri"/>
-          <w:b/>
-          <w:sz w:val="22"/>
-        </w:rPr>
-        <w:t xml:space="preserve">Inflammatory cascades: </w:t>
-      </w:r>
-      <w:r>
-        <w:rPr>
-          <w:rFonts w:ascii="Calibri" w:hAnsi="Calibri"/>
-          <w:sz w:val="22"/>
-        </w:rPr>
-        <w:t>escalate with activation of the AGE-RAGE signaling pathway in diabetic complications (path:hsa04933/rno04933; median BMD 8.75; 10 genes including IL1B, IL6, TNF, NFKB1, STAT3, TGFB1), NF-κB signaling (path:hsa04064/rno04064; median BMD 9.5), and JAK-STAT signaling (path:hsa04630/rno04630; median BMD 7.0). The upregulation of the master inflammatory cytokines TNF, IL1B, and IL6, together with their transcriptional regulators NFKB1 and STAT3, indicates a full inflammatory response.</w:t>
-      </w:r>
-    </w:p>
-    <w:p>
-      <w:pPr>
-        <w:spacing w:after="120"/>
-      </w:pPr>
-      <w:r>
-        <w:rPr>
-          <w:rFonts w:ascii="Calibri" w:hAnsi="Calibri"/>
-          <w:b/>
-          <w:sz w:val="22"/>
-        </w:rPr>
-        <w:t xml:space="preserve">Lipid and energy metabolism: </w:t>
-      </w:r>
-      <w:r>
-        <w:rPr>
-          <w:rFonts w:ascii="Calibri" w:hAnsi="Calibri"/>
-          <w:sz w:val="22"/>
-        </w:rPr>
-        <w:t>pathways including PPAR signaling, insulin resistance (path:hsa04931/rno04931; median BMD 9.0), and adipocytokine signaling (path:hsa04920/rno04920; median BMD 8.75) are perturbed, consistent with metabolic disruption secondary to oxidative stress and inflammation.</w:t>
-      </w:r>
-    </w:p>
-    <w:p>
-      <w:pPr>
-        <w:pStyle w:val="Heading3"/>
-      </w:pPr>
-      <w:r>
-        <w:t>High Dose Range (BMD 8.0–20): Immune Activation, Fibrosis, and Systemic Toxicity</w:t>
+        <w:t>The enrichment of **fluid shear stress and atherosclerosis** pathways (path:hsa05418/rno05418, median BMD 4.0, 11 genes) is highly informative, as this pathway integrates oxidative stress (NFE2L2, HMOX1, NQO1), inflammation (IL1B, TNF, NFKB1), and endothelial dysfunction (VEGFA, TP53). The **lipid and atherosclerosis** pathway (path:hsa05417/rno05417, median BMD 8.25 for the full gene set but with early-responding members) further reinforces vascular toxicity as a concern.</w:t>
       </w:r>
     </w:p>
     <w:p>
@@ -1555,7 +1576,15 @@
           <w:i w:val="0"/>
           <w:sz w:val="22"/>
         </w:rPr>
-        <w:t>At the highest doses, the response profile shifts toward innate and adaptive immune activation, with engagement of Toll-like receptor signaling (path:hsa04620/rno04620; median BMD 10.5), NOD-like receptor signaling (path:hsa04621/rno04621; median BMD 10.5), RIG-I-like receptor signaling (path:hsa04622/rno04622; median BMD 9.5), and cytokine-cytokine receptor interaction (path:hsa04060/rno04060; median BMD 11.0). The NLRP3 inflammasome pathway (median BMD 12.0) and the senescence-associated secretory phenotype (SASP; median BMD 10.25) are activated, indicating sterile inflammation and cellular senescence.</w:t>
+        <w:t>The **chemical carcinogenesis – reactive oxygen species** pathway (path:hsa05207/rno05207, median BMD 4.0, 7 genes) confirms that ROS generation is a central mechanism at this dose level.</w:t>
+      </w:r>
+    </w:p>
+    <w:p>
+      <w:pPr>
+        <w:pStyle w:val="Heading3"/>
+      </w:pPr>
+      <w:r>
+        <w:t>Phase VI: Inflammatory Cascade and Inflammasome Activation (BMD 5.0–10.0)</w:t>
       </w:r>
     </w:p>
     <w:p>
@@ -1569,7 +1598,199 @@
           <w:i w:val="0"/>
           <w:sz w:val="22"/>
         </w:rPr>
-        <w:t>The upregulation of TGFB1 at higher doses, combined with VEGFA and HIF1A, suggests progression toward fibrogenic and angiogenic remodeling responses. Multiple infection-related pathways (Shigellosis, Salmonella, Legionellosis, Tuberculosis, etc.) are enriched at BMD 10–13, reflecting the engagement of generic innate immune defense modules rather than actual infection—these pathways share core inflammatory and apoptotic effectors (TNF, IL1B, IL6, NFKB1, CASP3, BAX) that are activated by sterile tissue injury.</w:t>
+        <w:t>This phase marks the transition from predominantly adaptive to overtly adverse responses. Key developments include:</w:t>
+      </w:r>
+    </w:p>
+    <w:p>
+      <w:pPr>
+        <w:pStyle w:val="ListBullet"/>
+        <w:spacing w:after="40"/>
+      </w:pPr>
+      <w:r>
+        <w:rPr>
+          <w:rFonts w:ascii="Calibri" w:hAnsi="Calibri"/>
+          <w:sz w:val="22"/>
+        </w:rPr>
+        <w:t>**Full engagement of the pathways in cancer** (path:hsa05200/rno05200, median BMD 5.0, 15 genes) — the most significantly enriched pathway (p = 3.65 × 10⁻³⁸)</w:t>
+      </w:r>
+    </w:p>
+    <w:p>
+      <w:pPr>
+        <w:pStyle w:val="ListBullet"/>
+        <w:spacing w:after="40"/>
+      </w:pPr>
+      <w:r>
+        <w:rPr>
+          <w:rFonts w:ascii="Calibri" w:hAnsi="Calibri"/>
+          <w:sz w:val="22"/>
+        </w:rPr>
+        <w:t>**TP53 signaling pathway** activation (path:hsa04115, median BMD 5.5, 5 genes) with upregulation of pro-apoptotic effectors</w:t>
+      </w:r>
+    </w:p>
+    <w:p>
+      <w:pPr>
+        <w:pStyle w:val="ListBullet"/>
+        <w:spacing w:after="40"/>
+      </w:pPr>
+      <w:r>
+        <w:rPr>
+          <w:rFonts w:ascii="Calibri" w:hAnsi="Calibri"/>
+          <w:sz w:val="22"/>
+        </w:rPr>
+        <w:t>**Apoptosis pathway** engagement (path:hsa04210, median BMD 7.0, 6 genes) with BAX, CASP3, and BCL2 all upregulated — the simultaneous upregulation of both pro-apoptotic (BAX, CASP3) and anti-apoptotic (BCL2) factors indicates active apoptotic signaling with attempted counter-regulation</w:t>
+      </w:r>
+    </w:p>
+    <w:p>
+      <w:pPr>
+        <w:pStyle w:val="ListBullet"/>
+        <w:spacing w:after="40"/>
+      </w:pPr>
+      <w:r>
+        <w:rPr>
+          <w:rFonts w:ascii="Calibri" w:hAnsi="Calibri"/>
+          <w:sz w:val="22"/>
+        </w:rPr>
+        <w:t>**NF-κB signaling** (path:hsa04064, median BMD 9.5) and **TNF signaling** (path:hsa04668, median BMD 10.0) driving inflammatory cytokine production</w:t>
+      </w:r>
+    </w:p>
+    <w:p>
+      <w:pPr>
+        <w:pStyle w:val="ListBullet"/>
+        <w:spacing w:after="40"/>
+      </w:pPr>
+      <w:r>
+        <w:rPr>
+          <w:rFonts w:ascii="Calibri" w:hAnsi="Calibri"/>
+          <w:sz w:val="22"/>
+        </w:rPr>
+        <w:t>**NLRP3 inflammasome** activation, evidenced by upregulation of NLRP3 and IL1B, with inflammasome-specific pathways enriched at median BMD 12.0</w:t>
+      </w:r>
+    </w:p>
+    <w:p>
+      <w:pPr>
+        <w:pStyle w:val="ListBullet"/>
+        <w:spacing w:after="40"/>
+      </w:pPr>
+      <w:r>
+        <w:rPr>
+          <w:rFonts w:ascii="Calibri" w:hAnsi="Calibri"/>
+          <w:sz w:val="22"/>
+        </w:rPr>
+        <w:t>**IL-17 signaling** (path:hsa04657, median BMD 10.0) and **Th17 cell differentiation** (path:hsa04659, median BMD 9.0) indicating adaptive immune activation</w:t>
+      </w:r>
+    </w:p>
+    <w:p>
+      <w:pPr>
+        <w:spacing w:after="120"/>
+      </w:pPr>
+      <w:r>
+        <w:rPr>
+          <w:rFonts w:ascii="Calibri" w:hAnsi="Calibri"/>
+          <w:b w:val="0"/>
+          <w:i w:val="0"/>
+          <w:sz w:val="22"/>
+        </w:rPr>
+        <w:t>The **JAK-STAT signaling pathway** (path:hsa04630, median BMD 7.0) and **MAPK signaling** (path:hsa04010, median BMD 9.0) represent broad activation of stress-responsive kinase cascades.</w:t>
+      </w:r>
+    </w:p>
+    <w:p>
+      <w:pPr>
+        <w:pStyle w:val="Heading3"/>
+      </w:pPr>
+      <w:r>
+        <w:t>Phase VII: Tissue Damage, Fibrosis, and Immune Activation (BMD 10.0–20.0)</w:t>
+      </w:r>
+    </w:p>
+    <w:p>
+      <w:pPr>
+        <w:spacing w:after="120"/>
+      </w:pPr>
+      <w:r>
+        <w:rPr>
+          <w:rFonts w:ascii="Calibri" w:hAnsi="Calibri"/>
+          <w:b w:val="0"/>
+          <w:i w:val="0"/>
+          <w:sz w:val="22"/>
+        </w:rPr>
+        <w:t>At the highest doses, the response profile indicates frank tissue injury:</w:t>
+      </w:r>
+    </w:p>
+    <w:p>
+      <w:pPr>
+        <w:pStyle w:val="ListBullet"/>
+        <w:spacing w:after="40"/>
+      </w:pPr>
+      <w:r>
+        <w:rPr>
+          <w:rFonts w:ascii="Calibri" w:hAnsi="Calibri"/>
+          <w:sz w:val="22"/>
+        </w:rPr>
+        <w:t>**Necroptosis** (path:hsa04217, median BMD 8.5) — programmed necrotic cell death</w:t>
+      </w:r>
+    </w:p>
+    <w:p>
+      <w:pPr>
+        <w:pStyle w:val="ListBullet"/>
+        <w:spacing w:after="40"/>
+      </w:pPr>
+      <w:r>
+        <w:rPr>
+          <w:rFonts w:ascii="Calibri" w:hAnsi="Calibri"/>
+          <w:sz w:val="22"/>
+        </w:rPr>
+        <w:t>**Cellular senescence** (path:hsa04218, median BMD 5.0) and **Senescence-Associated Secretory Phenotype (SASP)** (median BMD 10.25) — indicating irreversible growth arrest with pro-inflammatory secretome</w:t>
+      </w:r>
+    </w:p>
+    <w:p>
+      <w:pPr>
+        <w:pStyle w:val="ListBullet"/>
+        <w:spacing w:after="40"/>
+      </w:pPr>
+      <w:r>
+        <w:rPr>
+          <w:rFonts w:ascii="Calibri" w:hAnsi="Calibri"/>
+          <w:sz w:val="22"/>
+        </w:rPr>
+        <w:t>**TGF-beta signaling** (path:hsa04350, median BMD 12.5) with TGFB1 upregulation — a hallmark of fibrotic remodeling</w:t>
+      </w:r>
+    </w:p>
+    <w:p>
+      <w:pPr>
+        <w:pStyle w:val="ListBullet"/>
+        <w:spacing w:after="40"/>
+      </w:pPr>
+      <w:r>
+        <w:rPr>
+          <w:rFonts w:ascii="Calibri" w:hAnsi="Calibri"/>
+          <w:sz w:val="22"/>
+        </w:rPr>
+        <w:t>**Toll-like receptor signaling** (path:hsa04620, median BMD 10.5) and **NOD-like receptor signaling** (path:hsa04621, median BMD 10.5) — innate immune activation</w:t>
+      </w:r>
+    </w:p>
+    <w:p>
+      <w:pPr>
+        <w:pStyle w:val="ListBullet"/>
+        <w:spacing w:after="40"/>
+      </w:pPr>
+      <w:r>
+        <w:rPr>
+          <w:rFonts w:ascii="Calibri" w:hAnsi="Calibri"/>
+          <w:sz w:val="22"/>
+        </w:rPr>
+        <w:t>**Rheumatoid arthritis** (path:hsa05323, median BMD 11.0), **inflammatory bowel disease** (path:hsa05321, median BMD 10.5), and **graft-versus-host disease** (path:hsa05332, median BMD 11.0) pathways — reflecting systemic inflammatory tissue damage</w:t>
+      </w:r>
+    </w:p>
+    <w:p>
+      <w:pPr>
+        <w:pStyle w:val="ListBullet"/>
+        <w:spacing w:after="40"/>
+      </w:pPr>
+      <w:r>
+        <w:rPr>
+          <w:rFonts w:ascii="Calibri" w:hAnsi="Calibri"/>
+          <w:sz w:val="22"/>
+        </w:rPr>
+        <w:t>Multiple **infectious disease pathways** (hepatitis B/C, Epstein-Barr virus, etc.) are enriched not because of infection but because these pathways share core inflammatory and apoptotic signaling nodes (NFKB1, TNF, IL6, STAT3, BAX, CASP3)</w:t>
       </w:r>
     </w:p>
     <w:p>
@@ -1599,7 +1820,7 @@
         <w:pStyle w:val="Heading3"/>
       </w:pPr>
       <w:r>
-        <w:t>Primary Target Organs</w:t>
+        <w:t>2.1 Liver (Highest Priority Target)</w:t>
       </w:r>
     </w:p>
     <w:p>
@@ -1613,7 +1834,7 @@
           <w:i w:val="0"/>
           <w:sz w:val="22"/>
         </w:rPr>
-        <w:t>Liver (enrichment score 45.06x; 31+ genes)</w:t>
+        <w:t>Confidence: Very High</w:t>
       </w:r>
     </w:p>
     <w:p>
@@ -1627,7 +1848,113 @@
           <w:i w:val="0"/>
           <w:sz w:val="22"/>
         </w:rPr>
-        <w:t>The liver emerges as the most comprehensively affected organ based on the breadth of gene involvement (AHR, BAX, BCL2, CASP3, CAT, CDKN1A, CYP1A1, CYP1B1, GCLC, GPX1, HMOX1, IL6, KEAP1, NFE2L2, NFKB1, NQO1, PPARA, SIRT1, SOD1, SOD2, SQSTM1, STAT3, TGFB1, TNF, TP53, VEGFA, and others). The early activation of AHR-CYP1A1/CYP1B1 xenobiotic metabolism, followed by Nrf2-mediated detoxification, and subsequent NF-κB-driven inflammation recapitulates the canonical hepatotoxicity progression. The literature strongly supports this interpretation: quantitative transcriptional biomarkers for xenobiotic receptor activation (AHR, PPARA, NFE2L2) in rat liver predict drug-induced liver injury (DILI) with high sensitivity and specificity (Quantitative Transcriptional Biomarkers of Xenobiotic Receptor Activation, 2020). The activation of hepatic Kupffer cell markers (HMOX1, enrichment 671.56x) and the cadmium-induced toxicity literature describing NF-κB and Nrf2 activation in hepatic macrophages (Research Advances on Cadmium-Induced Toxicity in Hepatic Macrophages, 2026) further support hepatotoxicity as a primary outcome.</w:t>
+        <w:t>The liver emerges as the primary target organ based on multiple converging lines of evidence:</w:t>
+      </w:r>
+    </w:p>
+    <w:p>
+      <w:pPr>
+        <w:pStyle w:val="ListBullet"/>
+        <w:spacing w:after="40"/>
+      </w:pPr>
+      <w:r>
+        <w:rPr>
+          <w:rFonts w:ascii="Calibri" w:hAnsi="Calibri"/>
+          <w:sz w:val="22"/>
+        </w:rPr>
+        <w:t>**Gene coverage**: The liver organ signature includes the broadest set of responsive genes (34+ genes), encompassing AHR, CYP1A1, CYP1B1, CYP3A4, NFE2L2, KEAP1, NQO1, HMOX1, GCLC, GPX1, CAT, SOD1, SOD2, BAX, BCL2, CASP3, TP53, CDKN1A, NFKB1, NLRP3, IL1B, IL6, TNF, STAT3, TGFB1, SIRT1, PPARA, SQSTM1, HIF1A, and VEGFA.</w:t>
+      </w:r>
+    </w:p>
+    <w:p>
+      <w:pPr>
+        <w:pStyle w:val="ListBullet"/>
+        <w:spacing w:after="40"/>
+      </w:pPr>
+      <w:r>
+        <w:rPr>
+          <w:rFonts w:ascii="Calibri" w:hAnsi="Calibri"/>
+          <w:sz w:val="22"/>
+        </w:rPr>
+        <w:t>**Pathway specificity**: Hepatocellular carcinoma (path:hsa05225, median BMD 2.65) is among the earliest cancer pathways activated. Non-alcoholic fatty liver disease (path:hsa04932, median BMD 9.5) and hepatitis pathways (path:hsa05160/05161, median BMD 7.0–8.25) are prominently enriched.</w:t>
+      </w:r>
+    </w:p>
+    <w:p>
+      <w:pPr>
+        <w:pStyle w:val="ListBullet"/>
+        <w:spacing w:after="40"/>
+      </w:pPr>
+      <w:r>
+        <w:rPr>
+          <w:rFonts w:ascii="Calibri" w:hAnsi="Calibri"/>
+          <w:sz w:val="22"/>
+        </w:rPr>
+        <w:t>**AHR-CYP axis**: The liver is the primary site of AHR-mediated xenobiotic metabolism. CYP1A1, CYP1B1, and CYP3A4 are predominantly hepatic enzymes, and their induction at the lowest BMDs indicates the liver as the first organ to encounter and metabolize the compound.</w:t>
+      </w:r>
+    </w:p>
+    <w:p>
+      <w:pPr>
+        <w:pStyle w:val="ListBullet"/>
+        <w:spacing w:after="40"/>
+      </w:pPr>
+      <w:r>
+        <w:rPr>
+          <w:rFonts w:ascii="Calibri" w:hAnsi="Calibri"/>
+          <w:sz w:val="22"/>
+        </w:rPr>
+        <w:t>**NLRP3 inflammasome**: Literature strongly supports NLRP3 inflammasome activation as "a critical role in liver injury and disease progression" (NLRP3 Inflammasome Activation in Liver Disorders, 2025). The co-upregulation of NLRP3, IL1B, and NFKB1 is consistent with hepatic Kupffer cell activation.</w:t>
+      </w:r>
+    </w:p>
+    <w:p>
+      <w:pPr>
+        <w:pStyle w:val="ListBullet"/>
+        <w:spacing w:after="40"/>
+      </w:pPr>
+      <w:r>
+        <w:rPr>
+          <w:rFonts w:ascii="Calibri" w:hAnsi="Calibri"/>
+          <w:sz w:val="22"/>
+        </w:rPr>
+        <w:t>**NRF2-KEAP1 disruption**: The literature identifies "a novel mechanism of hepatotoxicity involving endoplasmic reticulum stress and Nrf2 activation" (Toxicogenomic module associations with pathogenesis, 2017), directly supporting the observed pattern.</w:t>
+      </w:r>
+    </w:p>
+    <w:p>
+      <w:pPr>
+        <w:pStyle w:val="ListBullet"/>
+        <w:spacing w:after="40"/>
+      </w:pPr>
+      <w:r>
+        <w:rPr>
+          <w:rFonts w:ascii="Calibri" w:hAnsi="Calibri"/>
+          <w:sz w:val="22"/>
+        </w:rPr>
+        <w:t>**Fibrotic signaling**: TGFB1 upregulation combined with STAT3 activation is a hallmark of hepatic stellate cell activation and liver fibrosis.</w:t>
+      </w:r>
+    </w:p>
+    <w:p>
+      <w:pPr>
+        <w:spacing w:after="120"/>
+      </w:pPr>
+      <w:r>
+        <w:rPr>
+          <w:rFonts w:ascii="Calibri" w:hAnsi="Calibri"/>
+          <w:b/>
+          <w:sz w:val="22"/>
+        </w:rPr>
+        <w:t xml:space="preserve">Predicted hepatic effects: </w:t>
+      </w:r>
+      <w:r>
+        <w:rPr>
+          <w:rFonts w:ascii="Calibri" w:hAnsi="Calibri"/>
+          <w:sz w:val="22"/>
+        </w:rPr>
+        <w:t>Oxidative stress → hepatocellular injury → inflammation (Kupffer cell activation) → potential progression to fibrosis at sustained high exposures.</w:t>
+      </w:r>
+    </w:p>
+    <w:p>
+      <w:pPr>
+        <w:pStyle w:val="Heading3"/>
+      </w:pPr>
+      <w:r>
+        <w:t>2.2 Kidney (High Priority Target)</w:t>
       </w:r>
     </w:p>
     <w:p>
@@ -1641,21 +1968,87 @@
           <w:i w:val="0"/>
           <w:sz w:val="22"/>
         </w:rPr>
-        <w:t>Kidney (enrichment score 75.59x; 26+ genes)</w:t>
+        <w:t>Confidence: High</w:t>
       </w:r>
     </w:p>
     <w:p>
       <w:pPr>
-        <w:spacing w:after="120"/>
+        <w:pStyle w:val="ListBullet"/>
+        <w:spacing w:after="40"/>
       </w:pPr>
       <w:r>
         <w:rPr>
           <w:rFonts w:ascii="Calibri" w:hAnsi="Calibri"/>
-          <w:b w:val="0"/>
-          <w:i w:val="0"/>
           <w:sz w:val="22"/>
         </w:rPr>
-        <w:t>The kidney shows the second-highest gene coverage with involvement of AHR, BAX, BCL2, CASP3, CDKN1A, CYP1A1, CYP1B1, GCLC, GPX1, HMOX1, IL6, KEAP1, NFE2L2, NFKB1, NQO1, PPARA, SIRT1, SOD1, SOD2, SQSTM1, STAT3, TGFB1, TNF, TP53, and VEGFA. The renal tubular epithelium signature (HMOX1, enrichment 671.56x) is particularly notable, as HMOX1 induction is a well-established biomarker of renal oxidative injury. The literature on nanocurcumin mitigating doxorubicin-induced nephrotoxicity via VEGF and AhR pathways (Aryl Hydrocarbon Receptor and Vascular Endothelial Growth Factor, 2026) and fenofibrate-induced organ-specific PPARα-mediated toxicity in kidney (Fenofibrate differentially activates PPARα-mediated lipid metabolism, 2025) support renal vulnerability.</w:t>
+        <w:t>**Gene coverage**: 31+ responsive genes are annotated to kidney, including the full complement of antioxidant defense genes (NFE2L2, NQO1, HMOX1, GCLC, GPX1, CAT, SOD1, SOD2), apoptotic markers (BAX, BCL2, CASP3), and inflammatory mediators.</w:t>
+      </w:r>
+    </w:p>
+    <w:p>
+      <w:pPr>
+        <w:pStyle w:val="ListBullet"/>
+        <w:spacing w:after="40"/>
+      </w:pPr>
+      <w:r>
+        <w:rPr>
+          <w:rFonts w:ascii="Calibri" w:hAnsi="Calibri"/>
+          <w:sz w:val="22"/>
+        </w:rPr>
+        <w:t>**Renal tubular epithelium**: HMOX1 enrichment (693.56×) in renal tubular epithelium specifically indicates tubular oxidative stress.</w:t>
+      </w:r>
+    </w:p>
+    <w:p>
+      <w:pPr>
+        <w:pStyle w:val="ListBullet"/>
+        <w:spacing w:after="40"/>
+      </w:pPr>
+      <w:r>
+        <w:rPr>
+          <w:rFonts w:ascii="Calibri" w:hAnsi="Calibri"/>
+          <w:sz w:val="22"/>
+        </w:rPr>
+        <w:t>**Pathway evidence**: Renal cell carcinoma pathway (path:hsa05211, median BMD 4.25) and diabetic nephropathy-related AGE-RAGE signaling (path:hsa04933, median BMD 8.75) are enriched.</w:t>
+      </w:r>
+    </w:p>
+    <w:p>
+      <w:pPr>
+        <w:pStyle w:val="ListBullet"/>
+        <w:spacing w:after="40"/>
+      </w:pPr>
+      <w:r>
+        <w:rPr>
+          <w:rFonts w:ascii="Calibri" w:hAnsi="Calibri"/>
+          <w:sz w:val="22"/>
+        </w:rPr>
+        <w:t>**Literature support**: Rutin protection studies demonstrate that oxidative stress-mediated kidney damage involves the same gene network (BAX, BCL2, CASP3, NFE2L2, NFKB1) observed here (Rutin Protects from Destruction, 2021). HAVCR1 (KIM-1), a specific biomarker of renal tubular injury, is among the responsive genes annotated to "response to xenobiotic stimulus."</w:t>
+      </w:r>
+    </w:p>
+    <w:p>
+      <w:pPr>
+        <w:spacing w:after="120"/>
+      </w:pPr>
+      <w:r>
+        <w:rPr>
+          <w:rFonts w:ascii="Calibri" w:hAnsi="Calibri"/>
+          <w:b/>
+          <w:sz w:val="22"/>
+        </w:rPr>
+        <w:t xml:space="preserve">Predicted renal effects: </w:t>
+      </w:r>
+      <w:r>
+        <w:rPr>
+          <w:rFonts w:ascii="Calibri" w:hAnsi="Calibri"/>
+          <w:sz w:val="22"/>
+        </w:rPr>
+        <w:t>Proximal tubular oxidative stress → tubular cell apoptosis → inflammatory infiltration → potential tubulointerstitial fibrosis.</w:t>
+      </w:r>
+    </w:p>
+    <w:p>
+      <w:pPr>
+        <w:pStyle w:val="Heading3"/>
+      </w:pPr>
+      <w:r>
+        <w:t>2.3 Brain and Central Nervous System (High Priority Target)</w:t>
       </w:r>
     </w:p>
     <w:p>
@@ -1669,141 +2062,59 @@
           <w:i w:val="0"/>
           <w:sz w:val="22"/>
         </w:rPr>
-        <w:t>Heart (enrichment score 51.35x; 26+ genes)</w:t>
+        <w:t>Confidence: High</w:t>
       </w:r>
     </w:p>
     <w:p>
       <w:pPr>
-        <w:spacing w:after="120"/>
+        <w:pStyle w:val="ListBullet"/>
+        <w:spacing w:after="40"/>
       </w:pPr>
       <w:r>
         <w:rPr>
           <w:rFonts w:ascii="Calibri" w:hAnsi="Calibri"/>
-          <w:b w:val="0"/>
-          <w:i w:val="0"/>
           <w:sz w:val="22"/>
         </w:rPr>
-        <w:t>Cardiac tissue shows extensive gene involvement including AHR, BAX, BCL2, CASP3, CAT, CDKN1A, GDF15, GPX1, HMOX1, IL1B, IL6, KEAP1, NFE2L2, NFKB1, NQO1, SIRT1, SOD1, SOD2, STAT3, TGFB1, TNF, TP53, and VEGFA. The pericardium (IL1B, IL6; 335.78x), right ventricle (IL1B, TNF; 83.95x), and left ventricular myocardium (VEGFA; 111.93x) signatures suggest both inflammatory and vascular injury. The cardiomyocyte gene program literature (Cardiomyocyte gene programs encoding morphological and functional signatures, 2018) and whey protein cardioprotection studies (The cardioprotective effect of whey protein, 2025) confirm the relevance of these gene signatures to cardiac pathology.</w:t>
+        <w:t>**Gene coverage**: 27+ responsive genes annotated to brain, with particularly strong signatures in substantia nigra (9 genes including BAX, HMOX1, IL1B, IL6, NFE2L2, SOD1, SOD2, TNF), microglia (10+ genes), and hippocampus.</w:t>
       </w:r>
     </w:p>
     <w:p>
       <w:pPr>
-        <w:pStyle w:val="Heading3"/>
+        <w:pStyle w:val="ListBullet"/>
+        <w:spacing w:after="40"/>
       </w:pPr>
       <w:r>
-        <w:t>Secondary Target Organs</w:t>
+        <w:rPr>
+          <w:rFonts w:ascii="Calibri" w:hAnsi="Calibri"/>
+          <w:sz w:val="22"/>
+        </w:rPr>
+        <w:t>**Microglial activation**: The microglia signature (GCLC, HMOX1, IL1B, IL6, NFE2L2, NLRP3, NQO1, SIRT1, and additional genes) is among the most enriched organ signatures (390.13×). This is consistent with neuroinflammation driven by microglial NLRP3 inflammasome activation.</w:t>
       </w:r>
     </w:p>
     <w:p>
       <w:pPr>
-        <w:spacing w:after="120"/>
+        <w:pStyle w:val="ListBullet"/>
+        <w:spacing w:after="40"/>
       </w:pPr>
       <w:r>
         <w:rPr>
           <w:rFonts w:ascii="Calibri" w:hAnsi="Calibri"/>
-          <w:b/>
-          <w:i w:val="0"/>
           <w:sz w:val="22"/>
         </w:rPr>
-        <w:t>Brain/Central Nervous System (enrichment score 67.48x; 21+ genes)</w:t>
+        <w:t>**Blood-brain barrier**: Both BBB signatures (693.56× and 260.09×) show enrichment, with genes including HMOX1, NFE2L2, SIRT1, IL1B, IL6, and NLRP3. Literature confirms that "Microglial NLRP3-gasdermin D activation is essential for peripheral inflammation-induced BBB disruption" (2025).</w:t>
       </w:r>
     </w:p>
     <w:p>
       <w:pPr>
-        <w:spacing w:after="120"/>
+        <w:pStyle w:val="ListBullet"/>
+        <w:spacing w:after="40"/>
       </w:pPr>
       <w:r>
         <w:rPr>
           <w:rFonts w:ascii="Calibri" w:hAnsi="Calibri"/>
-          <w:b w:val="0"/>
-          <w:i w:val="0"/>
           <w:sz w:val="22"/>
         </w:rPr>
-        <w:t>The CNS shows strong enrichment across multiple sub-regions: cingulate cortex (NFE2L2; 671.56x), substantia nigra (BAX, TP53; 268.62x), hippocampal CA1 region (BAX, BCL2; 191.88x), neurons (11+ genes; 184.68x), and brain tissue (BAX, BCL2, CASP3, VEGFA; 447.71x). The neurodegenerative disease pathway enrichment (Alzheimer's, Parkinson's; path:hsa05012, path:hsa05014, path:hsa05020, path:hsa05010) and the GO term "negative regulation of neuron apoptotic process" (11 genes, FDR 2.80×10⁻¹³) indicate neurotoxic potential. Literature on cadmium-induced neurotoxicity in SH-SY5Y cells (Neuronal specific and non-specific responses to cadmium, 2019) and Zn/Se protection against heavy metal-mediated memory deficits (Zn and Se protect toxic metal mixture-mediated memory deficits, 2025) support this prediction.</w:t>
-      </w:r>
-    </w:p>
-    <w:p>
-      <w:pPr>
-        <w:spacing w:after="120"/>
-      </w:pPr>
-      <w:r>
-        <w:rPr>
-          <w:rFonts w:ascii="Calibri" w:hAnsi="Calibri"/>
-          <w:b/>
-          <w:i w:val="0"/>
-          <w:sz w:val="22"/>
-        </w:rPr>
-        <w:t>Intestine (enrichment score 172.69x; 18+ genes)</w:t>
-      </w:r>
-    </w:p>
-    <w:p>
-      <w:pPr>
-        <w:spacing w:after="120"/>
-      </w:pPr>
-      <w:r>
-        <w:rPr>
-          <w:rFonts w:ascii="Calibri" w:hAnsi="Calibri"/>
-          <w:b w:val="0"/>
-          <w:i w:val="0"/>
-          <w:sz w:val="22"/>
-        </w:rPr>
-        <w:t>The gastrointestinal tract, particularly the ileum (503.67x; HMOX1, KEAP1, NFE2L2, NQO1, SIRT1, SOD1), shows high enrichment. The intestinal Nrf2-Keap1 axis activation is consistent with the oyster peptide intestinal protection literature (Protective Effect of Oyster Peptides, 2022), suggesting the gut epithelium is a direct target of oxidative injury.</w:t>
-      </w:r>
-    </w:p>
-    <w:p>
-      <w:pPr>
-        <w:spacing w:after="120"/>
-      </w:pPr>
-      <w:r>
-        <w:rPr>
-          <w:rFonts w:ascii="Calibri" w:hAnsi="Calibri"/>
-          <w:b/>
-          <w:i w:val="0"/>
-          <w:sz w:val="22"/>
-        </w:rPr>
-        <w:t>Testis/Reproductive Organs (enrichment score 470.09x; 7 genes)</w:t>
-      </w:r>
-    </w:p>
-    <w:p>
-      <w:pPr>
-        <w:spacing w:after="120"/>
-      </w:pPr>
-      <w:r>
-        <w:rPr>
-          <w:rFonts w:ascii="Calibri" w:hAnsi="Calibri"/>
-          <w:b w:val="0"/>
-          <w:i w:val="0"/>
-          <w:sz w:val="22"/>
-        </w:rPr>
-        <w:t>The testis (BAX, BCL2, CASP3, CAT, GPX1, NFE2L2, TP53) and reproductive organs (BAX, BCL2, NFE2L2; 503.67x) show high enrichment, consistent with reproductive toxicity. The RuIII/Q complex literature describing amelioration of aging-induced reproductive toxicity (Potential Therapeutic Effects of New Ruthenium (III) Complex, 2021) confirms the relevance of these apoptotic and oxidative stress markers in testicular tissue.</w:t>
-      </w:r>
-    </w:p>
-    <w:p>
-      <w:pPr>
-        <w:spacing w:after="120"/>
-      </w:pPr>
-      <w:r>
-        <w:rPr>
-          <w:rFonts w:ascii="Calibri" w:hAnsi="Calibri"/>
-          <w:b/>
-          <w:i w:val="0"/>
-          <w:sz w:val="22"/>
-        </w:rPr>
-        <w:t>Lung (enrichment score 44.62x; 20+ genes)</w:t>
-      </w:r>
-    </w:p>
-    <w:p>
-      <w:pPr>
-        <w:spacing w:after="120"/>
-      </w:pPr>
-      <w:r>
-        <w:rPr>
-          <w:rFonts w:ascii="Calibri" w:hAnsi="Calibri"/>
-          <w:b w:val="0"/>
-          <w:i w:val="0"/>
-          <w:sz w:val="22"/>
-        </w:rPr>
-        <w:t>Pulmonary tissue shows involvement of multiple gene classes including xenobiotic metabolism (CYP1A1), antioxidant defense (CAT, GCLC, GPX1, SOD2), inflammation (IL6, TNF, NFKB1), and apoptosis (BAX, BCL2, CASP3). The lung epithelium (CYP1A1; 335.78x) and lung fibroblasts (CYP1B1; 671.56x) signatures suggest both epithelial and mesenchy</w:t>
+        <w:t>**Neurodegenerative pathways**: Alzheimer's disease (path:hsa05010, median BMD 10.0), Parkinson's disease (path</w:t>
       </w:r>
     </w:p>
     <w:sectPr>

</xml_diff>